<commit_message>
commit avances guia 2.4
</commit_message>
<xml_diff>
--- a/Fase 2/Evidencias Grupales/2.4_GuiaEstudiante_Fase 2_DesarrolloProyecto APT.docx
+++ b/Fase 2/Evidencias Grupales/2.4_GuiaEstudiante_Fase 2_DesarrolloProyecto APT.docx
@@ -162,7 +162,6 @@
                                 </w:rPr>
                                 <w:t xml:space="preserve">Asignatura </w:t>
                               </w:r>
-                              <w:proofErr w:type="spellStart"/>
                               <w:r>
                                 <w:rPr>
                                   <w:b/>
@@ -172,7 +171,6 @@
                                 </w:rPr>
                                 <w:t>Capstone</w:t>
                               </w:r>
-                              <w:proofErr w:type="spellEnd"/>
                             </w:p>
                           </w:txbxContent>
                         </wps:txbx>
@@ -340,7 +338,6 @@
                           </w:rPr>
                           <w:t xml:space="preserve">Asignatura </w:t>
                         </w:r>
-                        <w:proofErr w:type="spellStart"/>
                         <w:r>
                           <w:rPr>
                             <w:b/>
@@ -350,7 +347,6 @@
                           </w:rPr>
                           <w:t>Capstone</w:t>
                         </w:r>
-                        <w:proofErr w:type="spellEnd"/>
                       </w:p>
                     </w:txbxContent>
                   </v:textbox>
@@ -649,8 +645,6 @@
               </w:rPr>
               <w:t xml:space="preserve">El proyecto se encuentra en una etapa intermedia de desarrollo de la Épica 1: autenticación, usuarios y roles. La base técnica ya está construida y el entorno de trabajo ha sido estabilizado, por lo que el foco actual se encuentra en consolidar el flujo de autenticación y la gestión de </w:t>
             </w:r>
-            <w:proofErr w:type="spellStart"/>
-            <w:proofErr w:type="gramStart"/>
             <w:r>
               <w:rPr>
                 <w:rFonts w:ascii="Calibri" w:hAnsi="Calibri" w:cs="Arial"/>
@@ -671,10 +665,8 @@
                 <w:szCs w:val="20"/>
                 <w:lang w:eastAsia="es-CL"/>
               </w:rPr>
-              <w:t>En</w:t>
-            </w:r>
-            <w:proofErr w:type="spellEnd"/>
-            <w:proofErr w:type="gramEnd"/>
+              <w:t xml:space="preserve"> En</w:t>
+            </w:r>
             <w:r>
               <w:rPr>
                 <w:rFonts w:ascii="Calibri" w:hAnsi="Calibri" w:cs="Arial"/>
@@ -809,19 +801,17 @@
                 <w:lang w:eastAsia="es-CL"/>
               </w:rPr>
             </w:pPr>
-            <w:proofErr w:type="gramStart"/>
-            <w:r>
-              <w:rPr>
-                <w:rFonts w:ascii="Calibri" w:hAnsi="Calibri" w:cs="Arial"/>
-                <w:i/>
-                <w:color w:val="548DD4"/>
-                <w:sz w:val="20"/>
-                <w:szCs w:val="20"/>
-                <w:lang w:eastAsia="es-CL"/>
-              </w:rPr>
-              <w:t>En caso que</w:t>
-            </w:r>
-            <w:proofErr w:type="gramEnd"/>
+            <w:r>
+              <w:rPr>
+                <w:rFonts w:ascii="Calibri" w:hAnsi="Calibri" w:cs="Arial"/>
+                <w:i/>
+                <w:color w:val="548DD4"/>
+                <w:sz w:val="20"/>
+                <w:szCs w:val="20"/>
+                <w:lang w:eastAsia="es-CL"/>
+              </w:rPr>
+              <w:t>En caso de que</w:t>
+            </w:r>
             <w:r>
               <w:rPr>
                 <w:rFonts w:ascii="Calibri" w:hAnsi="Calibri" w:cs="Arial"/>
@@ -876,20 +866,197 @@
                 <w:color w:val="548DD4"/>
                 <w:sz w:val="20"/>
                 <w:szCs w:val="20"/>
-                <w:lang w:eastAsia="es-CL"/>
-              </w:rPr>
-            </w:pPr>
-            <w:r>
-              <w:rPr>
-                <w:rFonts w:ascii="Calibri" w:hAnsi="Calibri" w:cs="Arial"/>
-                <w:i/>
-                <w:color w:val="548DD4"/>
-                <w:sz w:val="20"/>
-                <w:szCs w:val="20"/>
-                <w:lang w:eastAsia="es-CL"/>
-              </w:rPr>
-              <w:t>Opcional en caso de ajuste</w:t>
-            </w:r>
+                <w:lang w:val="es-419" w:eastAsia="es-CL"/>
+              </w:rPr>
+            </w:pPr>
+            <w:r>
+              <w:rPr>
+                <w:rFonts w:ascii="Calibri" w:hAnsi="Calibri" w:cs="Arial"/>
+                <w:b/>
+                <w:bCs/>
+                <w:i/>
+                <w:color w:val="548DD4"/>
+                <w:sz w:val="20"/>
+                <w:szCs w:val="20"/>
+                <w:lang w:val="es-419" w:eastAsia="es-CL"/>
+              </w:rPr>
+              <w:t>Ajuste de alcance.</w:t>
+            </w:r>
+            <w:r>
+              <w:rPr>
+                <w:rFonts w:ascii="Calibri" w:hAnsi="Calibri" w:cs="Arial"/>
+                <w:b/>
+                <w:i/>
+                <w:color w:val="548DD4"/>
+                <w:sz w:val="20"/>
+                <w:szCs w:val="20"/>
+                <w:lang w:val="es-419" w:eastAsia="es-CL"/>
+              </w:rPr>
+              <w:t xml:space="preserve"> Se ratifica el producto mínimo viable de cuatro épicas: E1 Autenticación y control de acceso por rol, E2 Maestros core, E3 Recepción de tarjas y E4 Procesamiento de tarjas y auditoría. Los módulos de bodega, despacho y reportes de gestión, mencionados en la descripción y en los objetivos de la Fase 1, quedan para una fase posterior fuera del periodo académico.</w:t>
+            </w:r>
+          </w:p>
+          <w:p>
+            <w:pPr>
+              <w:jc w:val="both"/>
+              <w:rPr>
+                <w:rFonts w:ascii="Calibri" w:hAnsi="Calibri" w:cs="Arial"/>
+                <w:b/>
+                <w:i/>
+                <w:color w:val="548DD4"/>
+                <w:sz w:val="20"/>
+                <w:szCs w:val="20"/>
+                <w:lang w:val="es-419" w:eastAsia="es-CL"/>
+              </w:rPr>
+            </w:pPr>
+            <w:r>
+              <w:rPr>
+                <w:rFonts w:ascii="Calibri" w:hAnsi="Calibri" w:cs="Arial"/>
+                <w:b/>
+                <w:bCs/>
+                <w:i/>
+                <w:color w:val="548DD4"/>
+                <w:sz w:val="20"/>
+                <w:szCs w:val="20"/>
+                <w:lang w:val="es-419" w:eastAsia="es-CL"/>
+              </w:rPr>
+              <w:t>Objetivo general (ajustado):</w:t>
+            </w:r>
+            <w:r>
+              <w:rPr>
+                <w:rFonts w:ascii="Calibri" w:hAnsi="Calibri" w:cs="Arial"/>
+                <w:b/>
+                <w:i/>
+                <w:color w:val="548DD4"/>
+                <w:sz w:val="20"/>
+                <w:szCs w:val="20"/>
+                <w:lang w:val="es-419" w:eastAsia="es-CL"/>
+              </w:rPr>
+              <w:t xml:space="preserve"> Desarrollar e implementar el sistema de trazabilidad de fruta A2D SM bajo una arquitectura de tres capas (React – FastAPI – Base de datos) y estándares IEEE 830, ISO 9000 y PMI, eliminando las vulnerabilidades de seguridad del sistema legado y garantizando la integridad de las operaciones de recepción, procesamiento y auditoría.</w:t>
+            </w:r>
+          </w:p>
+          <w:p>
+            <w:pPr>
+              <w:jc w:val="both"/>
+              <w:rPr>
+                <w:rFonts w:ascii="Calibri" w:hAnsi="Calibri" w:cs="Arial"/>
+                <w:b/>
+                <w:i/>
+                <w:color w:val="548DD4"/>
+                <w:sz w:val="20"/>
+                <w:szCs w:val="20"/>
+                <w:lang w:val="es-419" w:eastAsia="es-CL"/>
+              </w:rPr>
+            </w:pPr>
+            <w:r>
+              <w:rPr>
+                <w:rFonts w:ascii="Calibri" w:hAnsi="Calibri" w:cs="Arial"/>
+                <w:b/>
+                <w:bCs/>
+                <w:i/>
+                <w:color w:val="548DD4"/>
+                <w:sz w:val="20"/>
+                <w:szCs w:val="20"/>
+                <w:lang w:val="es-419" w:eastAsia="es-CL"/>
+              </w:rPr>
+              <w:t>Objetivo específico 3 (ajustado):</w:t>
+            </w:r>
+            <w:r>
+              <w:rPr>
+                <w:rFonts w:ascii="Calibri" w:hAnsi="Calibri" w:cs="Arial"/>
+                <w:b/>
+                <w:i/>
+                <w:color w:val="548DD4"/>
+                <w:sz w:val="20"/>
+                <w:szCs w:val="20"/>
+                <w:lang w:val="es-419" w:eastAsia="es-CL"/>
+              </w:rPr>
+              <w:t xml:space="preserve"> Desarrollar la API backend en FastAPI para gestionar las reglas de negocio de recepción de fruta (tarjas, cálculo de kilos y stock de bandejas) y procesamiento (cálculo de rendimiento y merma).</w:t>
+            </w:r>
+          </w:p>
+          <w:p>
+            <w:pPr>
+              <w:jc w:val="both"/>
+              <w:rPr>
+                <w:rFonts w:ascii="Calibri" w:hAnsi="Calibri" w:cs="Arial"/>
+                <w:b/>
+                <w:i/>
+                <w:color w:val="548DD4"/>
+                <w:sz w:val="20"/>
+                <w:szCs w:val="20"/>
+                <w:lang w:val="es-419" w:eastAsia="es-CL"/>
+              </w:rPr>
+            </w:pPr>
+            <w:r>
+              <w:rPr>
+                <w:rFonts w:ascii="Calibri" w:hAnsi="Calibri" w:cs="Arial"/>
+                <w:b/>
+                <w:i/>
+                <w:color w:val="548DD4"/>
+                <w:sz w:val="20"/>
+                <w:szCs w:val="20"/>
+                <w:lang w:val="es-419" w:eastAsia="es-CL"/>
+              </w:rPr>
+              <w:t>Los demás objetivos específicos se mantienen sin cambios.</w:t>
+            </w:r>
+          </w:p>
+          <w:p>
+            <w:pPr>
+              <w:jc w:val="both"/>
+              <w:rPr>
+                <w:rFonts w:ascii="Calibri" w:hAnsi="Calibri" w:cs="Arial"/>
+                <w:b/>
+                <w:i/>
+                <w:color w:val="548DD4"/>
+                <w:sz w:val="20"/>
+                <w:szCs w:val="20"/>
+                <w:lang w:val="es-419" w:eastAsia="es-CL"/>
+              </w:rPr>
+            </w:pPr>
+            <w:r>
+              <w:rPr>
+                <w:rFonts w:ascii="Calibri" w:hAnsi="Calibri" w:cs="Arial"/>
+                <w:b/>
+                <w:bCs/>
+                <w:i/>
+                <w:color w:val="548DD4"/>
+                <w:sz w:val="20"/>
+                <w:szCs w:val="20"/>
+                <w:lang w:val="es-419" w:eastAsia="es-CL"/>
+              </w:rPr>
+              <w:lastRenderedPageBreak/>
+              <w:t>Roles del sistema:</w:t>
+            </w:r>
+            <w:r>
+              <w:rPr>
+                <w:rFonts w:ascii="Calibri" w:hAnsi="Calibri" w:cs="Arial"/>
+                <w:b/>
+                <w:i/>
+                <w:color w:val="548DD4"/>
+                <w:sz w:val="20"/>
+                <w:szCs w:val="20"/>
+                <w:lang w:val="es-419" w:eastAsia="es-CL"/>
+              </w:rPr>
+              <w:t xml:space="preserve"> operador de recepción, operador de proceso, administrador y gerencia. No se considera operador de bodega, porque ese módulo queda fuera del alcance.</w:t>
+            </w:r>
+          </w:p>
+          <w:p>
+            <w:pPr>
+              <w:pStyle w:val="Prrafodelista"/>
+              <w:numPr>
+                <w:ilvl w:val="0"/>
+                <w:numId w:val="3"/>
+              </w:numPr>
+              <w:jc w:val="both"/>
+              <w:rPr>
+                <w:rFonts w:ascii="Calibri" w:hAnsi="Calibri" w:cs="Arial"/>
+                <w:b/>
+                <w:i/>
+                <w:color w:val="548DD4"/>
+                <w:sz w:val="20"/>
+                <w:szCs w:val="20"/>
+                <w:lang w:eastAsia="es-CL"/>
+              </w:rPr>
+            </w:pPr>
           </w:p>
         </w:tc>
       </w:tr>
@@ -914,6 +1081,7 @@
                 <w:rFonts w:ascii="Calibri" w:hAnsi="Calibri"/>
                 <w:color w:val="1F3864" w:themeColor="accent1" w:themeShade="80"/>
               </w:rPr>
+              <w:lastRenderedPageBreak/>
               <w:t>Metodología</w:t>
             </w:r>
           </w:p>
@@ -944,7 +1112,7 @@
                 <w:szCs w:val="20"/>
                 <w:lang w:eastAsia="es-CL"/>
               </w:rPr>
-              <w:t>Opcional en caso de ajuste</w:t>
+              <w:t>Se mantiene Scrum con Poker Planning y sprints semanales. Se ajustan los roles del equipo: Alejandro Rodríguez como Project Manager, Angelo Galindo como QA y Diego Carrillo como Analista de base de datos. Los tres siguen participando en el desarrollo.</w:t>
             </w:r>
           </w:p>
         </w:tc>
@@ -1000,103 +1168,7 @@
                 <w:szCs w:val="20"/>
                 <w:lang w:eastAsia="es-CL"/>
               </w:rPr>
-              <w:t xml:space="preserve">Se evidenció la corrección de errores iniciales del proyecto, la configuración del entorno con </w:t>
-            </w:r>
-            <w:proofErr w:type="spellStart"/>
-            <w:r>
-              <w:rPr>
-                <w:rFonts w:ascii="Calibri" w:hAnsi="Calibri" w:cs="Arial"/>
-                <w:i/>
-                <w:color w:val="548DD4"/>
-                <w:sz w:val="20"/>
-                <w:szCs w:val="20"/>
-                <w:lang w:eastAsia="es-CL"/>
-              </w:rPr>
-              <w:t>FastAPI</w:t>
-            </w:r>
-            <w:proofErr w:type="spellEnd"/>
-            <w:r>
-              <w:rPr>
-                <w:rFonts w:ascii="Calibri" w:hAnsi="Calibri" w:cs="Arial"/>
-                <w:i/>
-                <w:color w:val="548DD4"/>
-                <w:sz w:val="20"/>
-                <w:szCs w:val="20"/>
-                <w:lang w:eastAsia="es-CL"/>
-              </w:rPr>
-              <w:t xml:space="preserve"> y SQL Server en Docker, la definición del modelo de usuarios y roles, y la preparación de </w:t>
-            </w:r>
-            <w:proofErr w:type="spellStart"/>
-            <w:r>
-              <w:rPr>
-                <w:rFonts w:ascii="Calibri" w:hAnsi="Calibri" w:cs="Arial"/>
-                <w:i/>
-                <w:color w:val="548DD4"/>
-                <w:sz w:val="20"/>
-                <w:szCs w:val="20"/>
-                <w:lang w:eastAsia="es-CL"/>
-              </w:rPr>
-              <w:t>schemas</w:t>
-            </w:r>
-            <w:proofErr w:type="spellEnd"/>
-            <w:r>
-              <w:rPr>
-                <w:rFonts w:ascii="Calibri" w:hAnsi="Calibri" w:cs="Arial"/>
-                <w:i/>
-                <w:color w:val="548DD4"/>
-                <w:sz w:val="20"/>
-                <w:szCs w:val="20"/>
-                <w:lang w:eastAsia="es-CL"/>
-              </w:rPr>
-              <w:t xml:space="preserve"> y dependencias para autenticación. También se verificó que el </w:t>
-            </w:r>
-            <w:proofErr w:type="spellStart"/>
-            <w:r>
-              <w:rPr>
-                <w:rFonts w:ascii="Calibri" w:hAnsi="Calibri" w:cs="Arial"/>
-                <w:i/>
-                <w:color w:val="548DD4"/>
-                <w:sz w:val="20"/>
-                <w:szCs w:val="20"/>
-                <w:lang w:eastAsia="es-CL"/>
-              </w:rPr>
-              <w:t>backend</w:t>
-            </w:r>
-            <w:proofErr w:type="spellEnd"/>
-            <w:r>
-              <w:rPr>
-                <w:rFonts w:ascii="Calibri" w:hAnsi="Calibri" w:cs="Arial"/>
-                <w:i/>
-                <w:color w:val="548DD4"/>
-                <w:sz w:val="20"/>
-                <w:szCs w:val="20"/>
-                <w:lang w:eastAsia="es-CL"/>
-              </w:rPr>
-              <w:t xml:space="preserve"> puede arrancar y responder a /</w:t>
-            </w:r>
-            <w:proofErr w:type="spellStart"/>
-            <w:r>
-              <w:rPr>
-                <w:rFonts w:ascii="Calibri" w:hAnsi="Calibri" w:cs="Arial"/>
-                <w:i/>
-                <w:color w:val="548DD4"/>
-                <w:sz w:val="20"/>
-                <w:szCs w:val="20"/>
-                <w:lang w:eastAsia="es-CL"/>
-              </w:rPr>
-              <w:t>health</w:t>
-            </w:r>
-            <w:proofErr w:type="spellEnd"/>
-            <w:r>
-              <w:rPr>
-                <w:rFonts w:ascii="Calibri" w:hAnsi="Calibri" w:cs="Arial"/>
-                <w:i/>
-                <w:color w:val="548DD4"/>
-                <w:sz w:val="20"/>
-                <w:szCs w:val="20"/>
-                <w:lang w:eastAsia="es-CL"/>
-              </w:rPr>
-              <w:t>, y que se ha dejado la base necesaria para continuar con la implementación del login y la autorización por roles.</w:t>
+              <w:t>Se evidenció la corrección de errores iniciales del proyecto, la configuración del entorno con FastAPI y SQL Server en Docker, la definición del modelo de usuarios y roles, y la preparación de schemas y dependencias para autenticación. También se verificó que el backend puede arrancar y responder a /health, y que se ha dejado la base necesaria para continuar con la implementación del login y la autorización por roles.</w:t>
             </w:r>
           </w:p>
           <w:p>
@@ -1124,34 +1196,18 @@
               </w:rPr>
               <w:t xml:space="preserve">Toda esta evidencia se encuentra en el repositorio: </w:t>
             </w:r>
-            <w:proofErr w:type="spellStart"/>
-            <w:proofErr w:type="gramStart"/>
-            <w:r>
-              <w:rPr>
-                <w:rFonts w:ascii="Calibri" w:hAnsi="Calibri" w:cs="Arial"/>
-                <w:b/>
-                <w:i/>
-                <w:color w:val="548DD4"/>
-                <w:sz w:val="20"/>
-                <w:szCs w:val="20"/>
-                <w:lang w:eastAsia="es-CL"/>
-              </w:rPr>
-              <w:t>git@github.com:Alejandroduoc</w:t>
-            </w:r>
-            <w:proofErr w:type="spellEnd"/>
-            <w:r>
-              <w:rPr>
-                <w:rFonts w:ascii="Calibri" w:hAnsi="Calibri" w:cs="Arial"/>
-                <w:b/>
-                <w:i/>
-                <w:color w:val="548DD4"/>
-                <w:sz w:val="20"/>
-                <w:szCs w:val="20"/>
-                <w:lang w:eastAsia="es-CL"/>
-              </w:rPr>
-              <w:t>/A2D_SM.git</w:t>
-            </w:r>
-            <w:proofErr w:type="gramEnd"/>
+            <w:r>
+              <w:rPr>
+                <w:rFonts w:ascii="Calibri" w:hAnsi="Calibri" w:cs="Arial"/>
+                <w:b/>
+                <w:i/>
+                <w:color w:val="548DD4"/>
+                <w:sz w:val="20"/>
+                <w:szCs w:val="20"/>
+                <w:lang w:eastAsia="es-CL"/>
+              </w:rPr>
+              <w:t>git@github.com:Alejandroduoc/A2D_SM.git</w:t>
+            </w:r>
           </w:p>
         </w:tc>
       </w:tr>
@@ -1199,7 +1255,6 @@
                 <w:sz w:val="28"/>
                 <w:szCs w:val="28"/>
               </w:rPr>
-              <w:lastRenderedPageBreak/>
               <w:t>2</w:t>
             </w:r>
             <w:r>
@@ -1329,6 +1384,7 @@
                 <w:color w:val="1F3864" w:themeColor="accent1" w:themeShade="80"/>
                 <w:sz w:val="18"/>
               </w:rPr>
+              <w:lastRenderedPageBreak/>
               <w:t>Plan de Trabajo</w:t>
             </w:r>
           </w:p>
@@ -1584,57 +1640,15 @@
             <w:r>
               <w:rPr>
                 <w:rFonts w:ascii="Calibri" w:hAnsi="Calibri" w:cs="Arial"/>
-                <w:i/>
-                <w:color w:val="548DD4"/>
-                <w:sz w:val="18"/>
-                <w:szCs w:val="20"/>
-                <w:lang w:eastAsia="es-CL"/>
-              </w:rPr>
-              <w:t xml:space="preserve">Nombra las competencias o unidades de competencias </w:t>
-            </w:r>
-            <w:r>
-              <w:rPr>
-                <w:rFonts w:ascii="Calibri" w:hAnsi="Calibri" w:cs="Arial"/>
-                <w:i/>
-                <w:color w:val="548DD4"/>
-                <w:sz w:val="18"/>
-                <w:szCs w:val="20"/>
-                <w:lang w:eastAsia="es-CL"/>
-              </w:rPr>
-              <w:t xml:space="preserve">que se relacionan con las diferentes actividades </w:t>
-            </w:r>
-            <w:r>
-              <w:rPr>
-                <w:rFonts w:ascii="Calibri" w:hAnsi="Calibri" w:cs="Arial"/>
-                <w:i/>
-                <w:color w:val="548DD4"/>
-                <w:sz w:val="18"/>
-                <w:szCs w:val="20"/>
-                <w:lang w:eastAsia="es-CL"/>
-              </w:rPr>
-              <w:t>requeridas para el desarrollo de</w:t>
-            </w:r>
-            <w:r>
-              <w:rPr>
-                <w:rFonts w:ascii="Calibri" w:hAnsi="Calibri" w:cs="Arial"/>
-                <w:i/>
-                <w:color w:val="548DD4"/>
-                <w:sz w:val="18"/>
-                <w:szCs w:val="20"/>
-                <w:lang w:eastAsia="es-CL"/>
-              </w:rPr>
-              <w:t>l proyecto APT</w:t>
-            </w:r>
-            <w:r>
-              <w:rPr>
-                <w:rFonts w:ascii="Calibri" w:hAnsi="Calibri" w:cs="Arial"/>
-                <w:i/>
-                <w:color w:val="548DD4"/>
-                <w:sz w:val="18"/>
-                <w:szCs w:val="20"/>
-                <w:lang w:eastAsia="es-CL"/>
-              </w:rPr>
-              <w:t>.</w:t>
+                <w:b/>
+                <w:bCs/>
+                <w:i/>
+                <w:color w:val="548DD4"/>
+                <w:sz w:val="18"/>
+                <w:szCs w:val="20"/>
+                <w:lang w:eastAsia="es-CL"/>
+              </w:rPr>
+              <w:t>Gestionar proyectos informáticos utilizando metodologías ágiles y herramientas de planificación.</w:t>
             </w:r>
           </w:p>
         </w:tc>
@@ -1663,51 +1677,7 @@
                 <w:szCs w:val="20"/>
                 <w:lang w:eastAsia="es-CL"/>
               </w:rPr>
-              <w:t>Nombra</w:t>
-            </w:r>
-            <w:r>
-              <w:rPr>
-                <w:rFonts w:ascii="Calibri" w:hAnsi="Calibri" w:cs="Arial"/>
-                <w:i/>
-                <w:color w:val="548DD4"/>
-                <w:sz w:val="18"/>
-                <w:szCs w:val="20"/>
-                <w:lang w:eastAsia="es-CL"/>
-              </w:rPr>
-              <w:t xml:space="preserve"> la</w:t>
-            </w:r>
-            <w:r>
-              <w:rPr>
-                <w:rFonts w:ascii="Calibri" w:hAnsi="Calibri" w:cs="Arial"/>
-                <w:i/>
-                <w:color w:val="548DD4"/>
-                <w:sz w:val="18"/>
-                <w:szCs w:val="20"/>
-                <w:lang w:eastAsia="es-CL"/>
-              </w:rPr>
-              <w:t>s</w:t>
-            </w:r>
-            <w:r>
-              <w:rPr>
-                <w:rFonts w:ascii="Calibri" w:hAnsi="Calibri" w:cs="Arial"/>
-                <w:i/>
-                <w:color w:val="548DD4"/>
-                <w:sz w:val="18"/>
-                <w:szCs w:val="20"/>
-                <w:lang w:eastAsia="es-CL"/>
-              </w:rPr>
-              <w:t xml:space="preserve"> </w:t>
-            </w:r>
-            <w:r>
-              <w:rPr>
-                <w:rFonts w:ascii="Calibri" w:hAnsi="Calibri" w:cs="Arial"/>
-                <w:i/>
-                <w:color w:val="548DD4"/>
-                <w:sz w:val="18"/>
-                <w:szCs w:val="20"/>
-                <w:lang w:eastAsia="es-CL"/>
-              </w:rPr>
-              <w:t xml:space="preserve">actividades que se necesitan para desarrollar el proyecto APT. </w:t>
+              <w:t>Planificar el desarrollo mediante épicas, historias de usuario, Story Points y sprints semanales. Mantener el backlog priorizado y registrar los avances del equipo.</w:t>
             </w:r>
           </w:p>
         </w:tc>
@@ -1733,29 +1703,7 @@
                 <w:szCs w:val="20"/>
                 <w:lang w:eastAsia="es-CL"/>
               </w:rPr>
-              <w:t>Nombra los recursos necesarios para llevar a cabo las actividades</w:t>
-            </w:r>
-            <w:r>
-              <w:rPr>
-                <w:rFonts w:ascii="Calibri" w:hAnsi="Calibri" w:cs="Arial"/>
-                <w:i/>
-                <w:color w:val="548DD4"/>
-                <w:sz w:val="18"/>
-                <w:szCs w:val="20"/>
-                <w:lang w:eastAsia="es-CL"/>
-              </w:rPr>
-              <w:t xml:space="preserve"> </w:t>
-            </w:r>
-            <w:r>
-              <w:rPr>
-                <w:rFonts w:ascii="Calibri" w:hAnsi="Calibri" w:cs="Arial"/>
-                <w:i/>
-                <w:color w:val="548DD4"/>
-                <w:sz w:val="18"/>
-                <w:szCs w:val="20"/>
-                <w:lang w:eastAsia="es-CL"/>
-              </w:rPr>
-              <w:t>definidas.</w:t>
+              <w:t>Scrum, Poker Planning, GitHub, repositorio A2D_SM, documentos de planificación y backlog.</w:t>
             </w:r>
           </w:p>
         </w:tc>
@@ -1781,51 +1729,7 @@
                 <w:szCs w:val="20"/>
                 <w:lang w:eastAsia="es-CL"/>
               </w:rPr>
-              <w:t xml:space="preserve">Señala </w:t>
-            </w:r>
-            <w:r>
-              <w:rPr>
-                <w:rFonts w:ascii="Calibri" w:hAnsi="Calibri" w:cs="Arial"/>
-                <w:i/>
-                <w:color w:val="548DD4"/>
-                <w:sz w:val="18"/>
-                <w:szCs w:val="20"/>
-                <w:lang w:eastAsia="es-CL"/>
-              </w:rPr>
-              <w:t>la duración de</w:t>
-            </w:r>
-            <w:r>
-              <w:rPr>
-                <w:rFonts w:ascii="Calibri" w:hAnsi="Calibri" w:cs="Arial"/>
-                <w:i/>
-                <w:color w:val="548DD4"/>
-                <w:sz w:val="18"/>
-                <w:szCs w:val="20"/>
-                <w:lang w:eastAsia="es-CL"/>
-              </w:rPr>
-              <w:t xml:space="preserve"> cada </w:t>
-            </w:r>
-            <w:r>
-              <w:rPr>
-                <w:rFonts w:ascii="Calibri" w:hAnsi="Calibri" w:cs="Arial"/>
-                <w:i/>
-                <w:color w:val="548DD4"/>
-                <w:sz w:val="18"/>
-                <w:szCs w:val="20"/>
-                <w:lang w:eastAsia="es-CL"/>
-              </w:rPr>
-              <w:t>actividad</w:t>
-            </w:r>
-            <w:r>
-              <w:rPr>
-                <w:rFonts w:ascii="Calibri" w:hAnsi="Calibri" w:cs="Arial"/>
-                <w:i/>
-                <w:color w:val="548DD4"/>
-                <w:sz w:val="18"/>
-                <w:szCs w:val="20"/>
-                <w:lang w:eastAsia="es-CL"/>
-              </w:rPr>
-              <w:t xml:space="preserve">. </w:t>
+              <w:t>Durante todo el proyecto. Sprints semanales.</w:t>
             </w:r>
           </w:p>
         </w:tc>
@@ -1854,40 +1758,7 @@
                 <w:szCs w:val="20"/>
                 <w:lang w:eastAsia="es-CL"/>
               </w:rPr>
-              <w:t xml:space="preserve">Escribe el </w:t>
-            </w:r>
-            <w:r>
-              <w:rPr>
-                <w:rFonts w:ascii="Calibri" w:hAnsi="Calibri" w:cs="Arial"/>
-                <w:i/>
-                <w:color w:val="548DD4"/>
-                <w:sz w:val="18"/>
-                <w:szCs w:val="20"/>
-                <w:lang w:eastAsia="es-CL"/>
-              </w:rPr>
-              <w:t xml:space="preserve">nombre del integrante del equipo responsable de </w:t>
-            </w:r>
-            <w:r>
-              <w:rPr>
-                <w:rFonts w:ascii="Calibri" w:hAnsi="Calibri" w:cs="Arial"/>
-                <w:i/>
-                <w:color w:val="548DD4"/>
-                <w:sz w:val="18"/>
-                <w:szCs w:val="20"/>
-                <w:lang w:eastAsia="es-CL"/>
-              </w:rPr>
-              <w:t xml:space="preserve">cada </w:t>
-            </w:r>
-            <w:r>
-              <w:rPr>
-                <w:rFonts w:ascii="Calibri" w:hAnsi="Calibri" w:cs="Arial"/>
-                <w:i/>
-                <w:color w:val="548DD4"/>
-                <w:sz w:val="18"/>
-                <w:szCs w:val="20"/>
-                <w:lang w:eastAsia="es-CL"/>
-              </w:rPr>
-              <w:t>actividad.</w:t>
+              <w:t>Alejandro Rodríguez, Project Manager.</w:t>
             </w:r>
           </w:p>
         </w:tc>
@@ -1916,40 +1787,7 @@
                 <w:szCs w:val="20"/>
                 <w:lang w:eastAsia="es-CL"/>
               </w:rPr>
-              <w:t xml:space="preserve">Señala </w:t>
-            </w:r>
-            <w:r>
-              <w:rPr>
-                <w:rFonts w:ascii="Calibri" w:hAnsi="Calibri" w:cs="Arial"/>
-                <w:i/>
-                <w:color w:val="548DD4"/>
-                <w:sz w:val="18"/>
-                <w:szCs w:val="20"/>
-                <w:lang w:eastAsia="es-CL"/>
-              </w:rPr>
-              <w:t>las dific</w:t>
-            </w:r>
-            <w:r>
-              <w:rPr>
-                <w:rFonts w:ascii="Calibri" w:hAnsi="Calibri" w:cs="Arial"/>
-                <w:i/>
-                <w:color w:val="548DD4"/>
-                <w:sz w:val="18"/>
-                <w:szCs w:val="20"/>
-                <w:lang w:eastAsia="es-CL"/>
-              </w:rPr>
-              <w:t>ult</w:t>
-            </w:r>
-            <w:r>
-              <w:rPr>
-                <w:rFonts w:ascii="Calibri" w:hAnsi="Calibri" w:cs="Arial"/>
-                <w:i/>
-                <w:color w:val="548DD4"/>
-                <w:sz w:val="18"/>
-                <w:szCs w:val="20"/>
-                <w:lang w:eastAsia="es-CL"/>
-              </w:rPr>
-              <w:t>ades o facilitadores que se podrían presentar durante la ejecución de cada una de las actividades propuestas.</w:t>
+              <w:t>El backlog contempla cuatro épicas y 23 historias de usuario, con un total estimado de 84 Story Points.</w:t>
             </w:r>
           </w:p>
         </w:tc>
@@ -1957,63 +1795,6 @@
           <w:tcPr>
             <w:tcW w:w="1418" w:type="dxa"/>
           </w:tcPr>
-          <w:p>
-            <w:pPr>
-              <w:jc w:val="both"/>
-              <w:rPr>
-                <w:rFonts w:ascii="Calibri" w:hAnsi="Calibri" w:cs="Arial"/>
-                <w:i/>
-                <w:color w:val="548DD4"/>
-                <w:sz w:val="18"/>
-                <w:szCs w:val="20"/>
-                <w:lang w:eastAsia="es-CL"/>
-              </w:rPr>
-            </w:pPr>
-            <w:r>
-              <w:rPr>
-                <w:rFonts w:ascii="Calibri" w:hAnsi="Calibri" w:cs="Arial"/>
-                <w:i/>
-                <w:color w:val="548DD4"/>
-                <w:sz w:val="18"/>
-                <w:szCs w:val="20"/>
-                <w:lang w:eastAsia="es-CL"/>
-              </w:rPr>
-              <w:t>D</w:t>
-            </w:r>
-            <w:r>
-              <w:rPr>
-                <w:rFonts w:ascii="Calibri" w:hAnsi="Calibri" w:cs="Arial"/>
-                <w:i/>
-                <w:color w:val="548DD4"/>
-                <w:sz w:val="18"/>
-                <w:szCs w:val="20"/>
-                <w:lang w:eastAsia="es-CL"/>
-              </w:rPr>
-              <w:t>escribe</w:t>
-            </w:r>
-            <w:r>
-              <w:rPr>
-                <w:rFonts w:ascii="Calibri" w:hAnsi="Calibri" w:cs="Arial"/>
-                <w:i/>
-                <w:color w:val="548DD4"/>
-                <w:sz w:val="18"/>
-                <w:szCs w:val="20"/>
-                <w:lang w:eastAsia="es-CL"/>
-              </w:rPr>
-              <w:t xml:space="preserve"> el estado de avance </w:t>
-            </w:r>
-            <w:r>
-              <w:rPr>
-                <w:rFonts w:ascii="Calibri" w:hAnsi="Calibri" w:cs="Arial"/>
-                <w:i/>
-                <w:color w:val="548DD4"/>
-                <w:sz w:val="18"/>
-                <w:szCs w:val="20"/>
-                <w:lang w:eastAsia="es-CL"/>
-              </w:rPr>
-              <w:t>de cada actividad.</w:t>
-            </w:r>
-          </w:p>
           <w:p>
             <w:pPr>
               <w:jc w:val="both"/>
@@ -2026,64 +1807,29 @@
                 <w:lang w:eastAsia="es-CL"/>
               </w:rPr>
             </w:pPr>
-          </w:p>
-          <w:p>
-            <w:pPr>
-              <w:jc w:val="both"/>
-              <w:rPr>
-                <w:rFonts w:ascii="Calibri" w:hAnsi="Calibri" w:cs="Arial"/>
-                <w:i/>
-                <w:color w:val="548DD4"/>
-                <w:sz w:val="18"/>
-                <w:szCs w:val="20"/>
-                <w:lang w:eastAsia="es-CL"/>
-              </w:rPr>
-            </w:pPr>
-            <w:r>
-              <w:rPr>
-                <w:rFonts w:ascii="Calibri" w:hAnsi="Calibri" w:cs="Arial"/>
-                <w:i/>
-                <w:color w:val="548DD4"/>
-                <w:sz w:val="18"/>
-                <w:szCs w:val="20"/>
-                <w:lang w:eastAsia="es-CL"/>
-              </w:rPr>
-              <w:t xml:space="preserve">Tipos de estado: </w:t>
-            </w:r>
-          </w:p>
-          <w:p>
-            <w:pPr>
-              <w:jc w:val="both"/>
-              <w:rPr>
-                <w:rFonts w:ascii="Calibri" w:hAnsi="Calibri" w:cs="Arial"/>
-                <w:i/>
-                <w:color w:val="C00000"/>
-                <w:sz w:val="16"/>
-                <w:szCs w:val="20"/>
-                <w:lang w:eastAsia="es-CL"/>
-              </w:rPr>
-            </w:pPr>
-            <w:r>
-              <w:rPr>
-                <w:rFonts w:ascii="Calibri" w:hAnsi="Calibri" w:cs="Arial"/>
-                <w:i/>
-                <w:color w:val="548DD4"/>
-                <w:sz w:val="18"/>
-                <w:szCs w:val="20"/>
-                <w:lang w:eastAsia="es-CL"/>
-              </w:rPr>
-              <w:t>En curso/ Con retraso/ No iniciado/ Completado/ Ajustada</w:t>
-            </w:r>
-            <w:r>
-              <w:rPr>
-                <w:rFonts w:ascii="Calibri" w:hAnsi="Calibri" w:cs="Arial"/>
-                <w:i/>
-                <w:color w:val="C00000"/>
-                <w:sz w:val="16"/>
-                <w:szCs w:val="20"/>
-                <w:lang w:eastAsia="es-CL"/>
-              </w:rPr>
-              <w:t xml:space="preserve"> </w:t>
+            <w:r>
+              <w:rPr>
+                <w:rFonts w:ascii="Calibri" w:hAnsi="Calibri" w:cs="Arial"/>
+                <w:b/>
+                <w:bCs/>
+                <w:i/>
+                <w:color w:val="548DD4"/>
+                <w:sz w:val="18"/>
+                <w:szCs w:val="20"/>
+                <w:lang w:eastAsia="es-CL"/>
+              </w:rPr>
+              <w:t>En ejecución.</w:t>
+            </w:r>
+            <w:r>
+              <w:rPr>
+                <w:rFonts w:ascii="Calibri" w:hAnsi="Calibri" w:cs="Arial"/>
+                <w:i/>
+                <w:color w:val="548DD4"/>
+                <w:sz w:val="18"/>
+                <w:szCs w:val="20"/>
+                <w:lang w:eastAsia="es-CL"/>
+              </w:rPr>
+              <w:t xml:space="preserve"> El backlog, las épicas, las historias de usuario y la planificación de sprints están documentados.</w:t>
             </w:r>
           </w:p>
         </w:tc>
@@ -2112,51 +1858,1325 @@
                 <w:szCs w:val="20"/>
                 <w:lang w:eastAsia="es-CL"/>
               </w:rPr>
-              <w:t>S</w:t>
-            </w:r>
-            <w:r>
-              <w:rPr>
-                <w:rFonts w:ascii="Calibri" w:hAnsi="Calibri" w:cs="Arial"/>
-                <w:i/>
-                <w:color w:val="548DD4"/>
-                <w:sz w:val="18"/>
-                <w:szCs w:val="20"/>
-                <w:lang w:eastAsia="es-CL"/>
-              </w:rPr>
-              <w:t>e</w:t>
-            </w:r>
-            <w:r>
-              <w:rPr>
-                <w:rFonts w:ascii="Calibri" w:hAnsi="Calibri" w:cs="Arial"/>
-                <w:i/>
-                <w:color w:val="548DD4"/>
-                <w:sz w:val="18"/>
-                <w:szCs w:val="20"/>
-                <w:lang w:eastAsia="es-CL"/>
-              </w:rPr>
-              <w:t xml:space="preserve">ñala los ajustes o reformulaciones </w:t>
-            </w:r>
-            <w:r>
-              <w:rPr>
-                <w:rFonts w:ascii="Calibri" w:hAnsi="Calibri" w:cs="Arial"/>
-                <w:i/>
-                <w:color w:val="548DD4"/>
-                <w:sz w:val="18"/>
-                <w:szCs w:val="20"/>
-                <w:lang w:eastAsia="es-CL"/>
-              </w:rPr>
-              <w:t>que has realiza</w:t>
-            </w:r>
-            <w:r>
-              <w:rPr>
-                <w:rFonts w:ascii="Calibri" w:hAnsi="Calibri" w:cs="Arial"/>
-                <w:i/>
-                <w:color w:val="548DD4"/>
-                <w:sz w:val="18"/>
-                <w:szCs w:val="20"/>
-                <w:lang w:eastAsia="es-CL"/>
-              </w:rPr>
-              <w:t xml:space="preserve">do. </w:t>
+              <w:t>Se ajustó el alcance original a cuatro épicas. Se eliminaron bodega, despacho y reportes de gestión del PMV</w:t>
+            </w:r>
+          </w:p>
+        </w:tc>
+      </w:tr>
+      <w:tr>
+        <w:trPr>
+          <w:trHeight w:val="2410"/>
+        </w:trPr>
+        <w:tc>
+          <w:tcPr>
+            <w:tcW w:w="1328" w:type="dxa"/>
+          </w:tcPr>
+          <w:p>
+            <w:pPr>
+              <w:jc w:val="both"/>
+              <w:rPr>
+                <w:rFonts w:ascii="Calibri" w:hAnsi="Calibri" w:cs="Arial"/>
+                <w:b/>
+                <w:bCs/>
+                <w:i/>
+                <w:color w:val="548DD4"/>
+                <w:sz w:val="18"/>
+                <w:szCs w:val="20"/>
+                <w:lang w:eastAsia="es-CL"/>
+              </w:rPr>
+            </w:pPr>
+            <w:r>
+              <w:rPr>
+                <w:rFonts w:ascii="Calibri" w:hAnsi="Calibri" w:cs="Arial"/>
+                <w:b/>
+                <w:bCs/>
+                <w:i/>
+                <w:color w:val="548DD4"/>
+                <w:sz w:val="18"/>
+                <w:szCs w:val="20"/>
+                <w:lang w:eastAsia="es-CL"/>
+              </w:rPr>
+              <w:t>Diseñar soluciones informáticas considerando arquitectura, seguridad y mantenibilidad.</w:t>
+            </w:r>
+          </w:p>
+        </w:tc>
+        <w:tc>
+          <w:tcPr>
+            <w:tcW w:w="1077" w:type="dxa"/>
+          </w:tcPr>
+          <w:p>
+            <w:pPr>
+              <w:jc w:val="both"/>
+              <w:rPr>
+                <w:rFonts w:ascii="Calibri" w:hAnsi="Calibri" w:cs="Arial"/>
+                <w:i/>
+                <w:color w:val="548DD4"/>
+                <w:sz w:val="18"/>
+                <w:szCs w:val="20"/>
+                <w:lang w:eastAsia="es-CL"/>
+              </w:rPr>
+            </w:pPr>
+            <w:r>
+              <w:rPr>
+                <w:rFonts w:ascii="Calibri" w:hAnsi="Calibri" w:cs="Arial"/>
+                <w:i/>
+                <w:color w:val="548DD4"/>
+                <w:sz w:val="18"/>
+                <w:szCs w:val="20"/>
+                <w:lang w:eastAsia="es-CL"/>
+              </w:rPr>
+              <w:t>Definir la arquitectura de tres capas: frontend, API backend y base de datos. Diseñar los diagramas de casos de uso, modelo E-R, clases, secuencia y componentes.</w:t>
+            </w:r>
+          </w:p>
+        </w:tc>
+        <w:tc>
+          <w:tcPr>
+            <w:tcW w:w="1276" w:type="dxa"/>
+          </w:tcPr>
+          <w:p>
+            <w:pPr>
+              <w:jc w:val="both"/>
+              <w:rPr>
+                <w:rFonts w:ascii="Calibri" w:hAnsi="Calibri" w:cs="Arial"/>
+                <w:i/>
+                <w:color w:val="548DD4"/>
+                <w:sz w:val="18"/>
+                <w:szCs w:val="20"/>
+                <w:lang w:eastAsia="es-CL"/>
+              </w:rPr>
+            </w:pPr>
+            <w:r>
+              <w:rPr>
+                <w:rFonts w:ascii="Calibri" w:hAnsi="Calibri" w:cs="Arial"/>
+                <w:i/>
+                <w:color w:val="548DD4"/>
+                <w:sz w:val="18"/>
+                <w:szCs w:val="20"/>
+                <w:lang w:eastAsia="es-CL"/>
+              </w:rPr>
+              <w:t>diagramas/Diagramas_Diseno.md, Mermaid, SQLAlchemy, FastAPI, React, SQL Server, Docker.</w:t>
+            </w:r>
+          </w:p>
+        </w:tc>
+        <w:tc>
+          <w:tcPr>
+            <w:tcW w:w="1276" w:type="dxa"/>
+          </w:tcPr>
+          <w:p>
+            <w:pPr>
+              <w:jc w:val="both"/>
+              <w:rPr>
+                <w:rFonts w:ascii="Calibri" w:hAnsi="Calibri" w:cs="Arial"/>
+                <w:i/>
+                <w:color w:val="548DD4"/>
+                <w:sz w:val="18"/>
+                <w:szCs w:val="20"/>
+                <w:lang w:eastAsia="es-CL"/>
+              </w:rPr>
+            </w:pPr>
+            <w:r>
+              <w:rPr>
+                <w:rFonts w:ascii="Calibri" w:hAnsi="Calibri" w:cs="Arial"/>
+                <w:i/>
+                <w:color w:val="548DD4"/>
+                <w:sz w:val="18"/>
+                <w:szCs w:val="20"/>
+                <w:lang w:eastAsia="es-CL"/>
+              </w:rPr>
+              <w:t>1 a 2 semanas, con actualización durante el desarrollo.</w:t>
+            </w:r>
+          </w:p>
+        </w:tc>
+        <w:tc>
+          <w:tcPr>
+            <w:tcW w:w="1275" w:type="dxa"/>
+          </w:tcPr>
+          <w:p>
+            <w:pPr>
+              <w:jc w:val="both"/>
+              <w:rPr>
+                <w:rFonts w:ascii="Calibri" w:hAnsi="Calibri" w:cs="Arial"/>
+                <w:i/>
+                <w:color w:val="548DD4"/>
+                <w:sz w:val="18"/>
+                <w:szCs w:val="20"/>
+                <w:lang w:eastAsia="es-CL"/>
+              </w:rPr>
+            </w:pPr>
+            <w:r>
+              <w:rPr>
+                <w:rFonts w:ascii="Calibri" w:hAnsi="Calibri" w:cs="Arial"/>
+                <w:i/>
+                <w:color w:val="548DD4"/>
+                <w:sz w:val="18"/>
+                <w:szCs w:val="20"/>
+                <w:lang w:eastAsia="es-CL"/>
+              </w:rPr>
+              <w:t>Todo el equipo</w:t>
+            </w:r>
+          </w:p>
+        </w:tc>
+        <w:tc>
+          <w:tcPr>
+            <w:tcW w:w="1276" w:type="dxa"/>
+          </w:tcPr>
+          <w:p>
+            <w:pPr>
+              <w:jc w:val="both"/>
+              <w:rPr>
+                <w:rFonts w:ascii="Calibri" w:hAnsi="Calibri" w:cs="Arial"/>
+                <w:i/>
+                <w:color w:val="548DD4"/>
+                <w:sz w:val="18"/>
+                <w:szCs w:val="20"/>
+                <w:lang w:eastAsia="es-CL"/>
+              </w:rPr>
+            </w:pPr>
+            <w:r>
+              <w:rPr>
+                <w:rFonts w:ascii="Calibri" w:hAnsi="Calibri" w:cs="Arial"/>
+                <w:i/>
+                <w:color w:val="548DD4"/>
+                <w:sz w:val="18"/>
+                <w:szCs w:val="20"/>
+                <w:lang w:eastAsia="es-CL"/>
+              </w:rPr>
+              <w:t>La arquitectura establece que ningún cliente se conecta directamente a la base de datos.</w:t>
+            </w:r>
+          </w:p>
+        </w:tc>
+        <w:tc>
+          <w:tcPr>
+            <w:tcW w:w="1418" w:type="dxa"/>
+          </w:tcPr>
+          <w:p>
+            <w:pPr>
+              <w:jc w:val="both"/>
+              <w:rPr>
+                <w:rFonts w:ascii="Calibri" w:hAnsi="Calibri" w:cs="Arial"/>
+                <w:b/>
+                <w:bCs/>
+                <w:i/>
+                <w:color w:val="548DD4"/>
+                <w:sz w:val="18"/>
+                <w:szCs w:val="20"/>
+                <w:lang w:eastAsia="es-CL"/>
+              </w:rPr>
+            </w:pPr>
+            <w:r>
+              <w:rPr>
+                <w:rFonts w:ascii="Calibri" w:hAnsi="Calibri" w:cs="Arial"/>
+                <w:b/>
+                <w:bCs/>
+                <w:i/>
+                <w:color w:val="548DD4"/>
+                <w:sz w:val="18"/>
+                <w:szCs w:val="20"/>
+                <w:lang w:eastAsia="es-CL"/>
+              </w:rPr>
+              <w:t>Avanzada. La arquitectura y los diagramas están documentados</w:t>
+            </w:r>
+          </w:p>
+        </w:tc>
+        <w:tc>
+          <w:tcPr>
+            <w:tcW w:w="850" w:type="dxa"/>
+          </w:tcPr>
+          <w:p>
+            <w:pPr>
+              <w:jc w:val="both"/>
+              <w:rPr>
+                <w:rFonts w:ascii="Calibri" w:hAnsi="Calibri" w:cs="Arial"/>
+                <w:i/>
+                <w:color w:val="548DD4"/>
+                <w:sz w:val="18"/>
+                <w:szCs w:val="20"/>
+                <w:lang w:eastAsia="es-CL"/>
+              </w:rPr>
+            </w:pPr>
+            <w:r>
+              <w:rPr>
+                <w:rFonts w:ascii="Calibri" w:hAnsi="Calibri" w:cs="Arial"/>
+                <w:i/>
+                <w:color w:val="548DD4"/>
+                <w:sz w:val="18"/>
+                <w:szCs w:val="20"/>
+                <w:lang w:eastAsia="es-CL"/>
+              </w:rPr>
+              <w:t xml:space="preserve">Se ajustaron los roles del sistema y se eliminaron módulos que ya no forman parte del alcance académico. El modelo E-R requiere algunas precisiones </w:t>
+            </w:r>
+            <w:r>
+              <w:rPr>
+                <w:rFonts w:ascii="Calibri" w:hAnsi="Calibri" w:cs="Arial"/>
+                <w:i/>
+                <w:color w:val="548DD4"/>
+                <w:sz w:val="18"/>
+                <w:szCs w:val="20"/>
+                <w:lang w:eastAsia="es-CL"/>
+              </w:rPr>
+              <w:lastRenderedPageBreak/>
+              <w:t>antes de implementarse completamente.</w:t>
+            </w:r>
+          </w:p>
+        </w:tc>
+      </w:tr>
+      <w:tr>
+        <w:trPr>
+          <w:trHeight w:val="2410"/>
+        </w:trPr>
+        <w:tc>
+          <w:tcPr>
+            <w:tcW w:w="1328" w:type="dxa"/>
+          </w:tcPr>
+          <w:p>
+            <w:pPr>
+              <w:jc w:val="both"/>
+              <w:rPr>
+                <w:rFonts w:ascii="Calibri" w:hAnsi="Calibri" w:cs="Arial"/>
+                <w:b/>
+                <w:bCs/>
+                <w:i/>
+                <w:color w:val="548DD4"/>
+                <w:sz w:val="18"/>
+                <w:szCs w:val="20"/>
+                <w:lang w:eastAsia="es-CL"/>
+              </w:rPr>
+            </w:pPr>
+            <w:r>
+              <w:rPr>
+                <w:rFonts w:ascii="Calibri" w:hAnsi="Calibri" w:cs="Arial"/>
+                <w:b/>
+                <w:bCs/>
+                <w:i/>
+                <w:color w:val="548DD4"/>
+                <w:sz w:val="18"/>
+                <w:szCs w:val="20"/>
+                <w:lang w:eastAsia="es-CL"/>
+              </w:rPr>
+              <w:lastRenderedPageBreak/>
+              <w:t>Implementar mecanismos de autenticación y control de acceso.</w:t>
+            </w:r>
+          </w:p>
+        </w:tc>
+        <w:tc>
+          <w:tcPr>
+            <w:tcW w:w="1077" w:type="dxa"/>
+          </w:tcPr>
+          <w:p>
+            <w:pPr>
+              <w:jc w:val="both"/>
+              <w:rPr>
+                <w:rFonts w:ascii="Calibri" w:hAnsi="Calibri" w:cs="Arial"/>
+                <w:i/>
+                <w:color w:val="548DD4"/>
+                <w:sz w:val="18"/>
+                <w:szCs w:val="20"/>
+                <w:lang w:eastAsia="es-CL"/>
+              </w:rPr>
+            </w:pPr>
+            <w:r>
+              <w:rPr>
+                <w:rFonts w:ascii="Calibri" w:hAnsi="Calibri" w:cs="Arial"/>
+                <w:i/>
+                <w:color w:val="548DD4"/>
+                <w:sz w:val="18"/>
+                <w:szCs w:val="20"/>
+                <w:lang w:eastAsia="es-CL"/>
+              </w:rPr>
+              <w:t>Crear usuarios, roles, login, generación de tokens JWT, hash de contraseñas, consulta del usuario autenticado y autorización por roles.</w:t>
+            </w:r>
+          </w:p>
+        </w:tc>
+        <w:tc>
+          <w:tcPr>
+            <w:tcW w:w="1276" w:type="dxa"/>
+          </w:tcPr>
+          <w:p>
+            <w:pPr>
+              <w:jc w:val="both"/>
+              <w:rPr>
+                <w:rFonts w:ascii="Calibri" w:hAnsi="Calibri" w:cs="Arial"/>
+                <w:i/>
+                <w:color w:val="548DD4"/>
+                <w:sz w:val="18"/>
+                <w:szCs w:val="20"/>
+                <w:lang w:eastAsia="es-CL"/>
+              </w:rPr>
+            </w:pPr>
+            <w:r>
+              <w:rPr>
+                <w:rFonts w:ascii="Calibri" w:hAnsi="Calibri" w:cs="Arial"/>
+                <w:i/>
+                <w:color w:val="548DD4"/>
+                <w:sz w:val="18"/>
+                <w:szCs w:val="20"/>
+                <w:lang w:eastAsia="es-CL"/>
+              </w:rPr>
+              <w:t>FastAPI, Pydantic, python-jose, Passlib, bcrypt, SQLAlchemy, SQL Server, app/core/security.py, app/api/deps.py.</w:t>
+            </w:r>
+          </w:p>
+        </w:tc>
+        <w:tc>
+          <w:tcPr>
+            <w:tcW w:w="1276" w:type="dxa"/>
+          </w:tcPr>
+          <w:p>
+            <w:pPr>
+              <w:jc w:val="both"/>
+              <w:rPr>
+                <w:rFonts w:ascii="Calibri" w:hAnsi="Calibri" w:cs="Arial"/>
+                <w:i/>
+                <w:color w:val="548DD4"/>
+                <w:sz w:val="18"/>
+                <w:szCs w:val="20"/>
+                <w:lang w:eastAsia="es-CL"/>
+              </w:rPr>
+            </w:pPr>
+            <w:r>
+              <w:rPr>
+                <w:rFonts w:ascii="Calibri" w:hAnsi="Calibri" w:cs="Arial"/>
+                <w:i/>
+                <w:color w:val="548DD4"/>
+                <w:sz w:val="18"/>
+                <w:szCs w:val="20"/>
+                <w:lang w:eastAsia="es-CL"/>
+              </w:rPr>
+              <w:t>Semanas 1,2 y 3</w:t>
+            </w:r>
+          </w:p>
+        </w:tc>
+        <w:tc>
+          <w:tcPr>
+            <w:tcW w:w="1275" w:type="dxa"/>
+          </w:tcPr>
+          <w:p>
+            <w:pPr>
+              <w:jc w:val="both"/>
+              <w:rPr>
+                <w:rFonts w:ascii="Calibri" w:hAnsi="Calibri" w:cs="Arial"/>
+                <w:i/>
+                <w:color w:val="548DD4"/>
+                <w:sz w:val="18"/>
+                <w:szCs w:val="20"/>
+                <w:lang w:eastAsia="es-CL"/>
+              </w:rPr>
+            </w:pPr>
+            <w:r>
+              <w:rPr>
+                <w:rFonts w:ascii="Calibri" w:hAnsi="Calibri" w:cs="Arial"/>
+                <w:i/>
+                <w:color w:val="548DD4"/>
+                <w:sz w:val="18"/>
+                <w:szCs w:val="20"/>
+                <w:lang w:eastAsia="es-CL"/>
+              </w:rPr>
+              <w:t>Todo el equipo</w:t>
+            </w:r>
+          </w:p>
+        </w:tc>
+        <w:tc>
+          <w:tcPr>
+            <w:tcW w:w="1276" w:type="dxa"/>
+          </w:tcPr>
+          <w:p>
+            <w:pPr>
+              <w:jc w:val="both"/>
+              <w:rPr>
+                <w:rFonts w:ascii="Calibri" w:hAnsi="Calibri" w:cs="Arial"/>
+                <w:i/>
+                <w:color w:val="548DD4"/>
+                <w:sz w:val="18"/>
+                <w:szCs w:val="20"/>
+                <w:lang w:eastAsia="es-CL"/>
+              </w:rPr>
+            </w:pPr>
+            <w:r>
+              <w:rPr>
+                <w:rFonts w:ascii="Calibri" w:hAnsi="Calibri" w:cs="Arial"/>
+                <w:i/>
+                <w:color w:val="548DD4"/>
+                <w:sz w:val="18"/>
+                <w:szCs w:val="20"/>
+                <w:lang w:eastAsia="es-CL"/>
+              </w:rPr>
+              <w:t>Se definieron los roles de operador de recepción, operador de proceso, administrador y gerencia</w:t>
+            </w:r>
+          </w:p>
+        </w:tc>
+        <w:tc>
+          <w:tcPr>
+            <w:tcW w:w="1418" w:type="dxa"/>
+          </w:tcPr>
+          <w:p>
+            <w:pPr>
+              <w:jc w:val="both"/>
+              <w:rPr>
+                <w:rFonts w:ascii="Calibri" w:hAnsi="Calibri" w:cs="Arial"/>
+                <w:b/>
+                <w:bCs/>
+                <w:i/>
+                <w:color w:val="548DD4"/>
+                <w:sz w:val="18"/>
+                <w:szCs w:val="20"/>
+                <w:lang w:eastAsia="es-CL"/>
+              </w:rPr>
+            </w:pPr>
+            <w:r>
+              <w:rPr>
+                <w:rFonts w:ascii="Calibri" w:hAnsi="Calibri" w:cs="Arial"/>
+                <w:b/>
+                <w:bCs/>
+                <w:i/>
+                <w:color w:val="548DD4"/>
+                <w:sz w:val="18"/>
+                <w:szCs w:val="20"/>
+                <w:lang w:eastAsia="es-CL"/>
+              </w:rPr>
+              <w:t>Completada para el backend. La API, los modelos, el login, la gestión de usuarios y las dependencias de autorización están implementados y probados.</w:t>
+            </w:r>
+          </w:p>
+        </w:tc>
+        <w:tc>
+          <w:tcPr>
+            <w:tcW w:w="850" w:type="dxa"/>
+          </w:tcPr>
+          <w:p>
+            <w:pPr>
+              <w:jc w:val="both"/>
+              <w:rPr>
+                <w:rFonts w:ascii="Calibri" w:hAnsi="Calibri" w:cs="Arial"/>
+                <w:i/>
+                <w:color w:val="548DD4"/>
+                <w:sz w:val="18"/>
+                <w:szCs w:val="20"/>
+                <w:lang w:eastAsia="es-CL"/>
+              </w:rPr>
+            </w:pPr>
+            <w:r>
+              <w:rPr>
+                <w:rFonts w:ascii="Calibri" w:hAnsi="Calibri" w:cs="Arial"/>
+                <w:i/>
+                <w:color w:val="548DD4"/>
+                <w:sz w:val="18"/>
+                <w:szCs w:val="20"/>
+                <w:lang w:eastAsia="es-CL"/>
+              </w:rPr>
+              <w:t>Se reemplazó la definición inicial de “Operador y Administrador” por cuatro roles específicos. Se descartaron productor externo, cliente y operador de bodega.</w:t>
+            </w:r>
+          </w:p>
+        </w:tc>
+      </w:tr>
+      <w:tr>
+        <w:trPr>
+          <w:trHeight w:val="2410"/>
+        </w:trPr>
+        <w:tc>
+          <w:tcPr>
+            <w:tcW w:w="1328" w:type="dxa"/>
+          </w:tcPr>
+          <w:p>
+            <w:pPr>
+              <w:jc w:val="both"/>
+              <w:rPr>
+                <w:rFonts w:ascii="Calibri" w:hAnsi="Calibri" w:cs="Arial"/>
+                <w:b/>
+                <w:bCs/>
+                <w:i/>
+                <w:color w:val="548DD4"/>
+                <w:sz w:val="18"/>
+                <w:szCs w:val="20"/>
+                <w:lang w:eastAsia="es-CL"/>
+              </w:rPr>
+            </w:pPr>
+            <w:r>
+              <w:rPr>
+                <w:rFonts w:ascii="Calibri" w:hAnsi="Calibri" w:cs="Arial"/>
+                <w:b/>
+                <w:bCs/>
+                <w:i/>
+                <w:color w:val="548DD4"/>
+                <w:sz w:val="18"/>
+                <w:szCs w:val="20"/>
+                <w:lang w:eastAsia="es-CL"/>
+              </w:rPr>
+              <w:t>Diseñar e implementar la base de datos y sus migraciones.</w:t>
+            </w:r>
+          </w:p>
+        </w:tc>
+        <w:tc>
+          <w:tcPr>
+            <w:tcW w:w="1077" w:type="dxa"/>
+          </w:tcPr>
+          <w:p>
+            <w:pPr>
+              <w:jc w:val="both"/>
+              <w:rPr>
+                <w:rFonts w:ascii="Calibri" w:hAnsi="Calibri" w:cs="Arial"/>
+                <w:i/>
+                <w:color w:val="548DD4"/>
+                <w:sz w:val="18"/>
+                <w:szCs w:val="20"/>
+                <w:lang w:eastAsia="es-CL"/>
+              </w:rPr>
+            </w:pPr>
+            <w:r>
+              <w:rPr>
+                <w:rFonts w:ascii="Calibri" w:hAnsi="Calibri" w:cs="Arial"/>
+                <w:i/>
+                <w:color w:val="548DD4"/>
+                <w:sz w:val="18"/>
+                <w:szCs w:val="20"/>
+                <w:lang w:eastAsia="es-CL"/>
+              </w:rPr>
+              <w:t>Crear el modelo de usuarios y roles, configurar SQL Server, generar la migración inicial y documentar el procedimiento para aplicar futuras migraciones.</w:t>
+            </w:r>
+          </w:p>
+        </w:tc>
+        <w:tc>
+          <w:tcPr>
+            <w:tcW w:w="1276" w:type="dxa"/>
+          </w:tcPr>
+          <w:p>
+            <w:pPr>
+              <w:jc w:val="both"/>
+              <w:rPr>
+                <w:rFonts w:ascii="Calibri" w:hAnsi="Calibri" w:cs="Arial"/>
+                <w:i/>
+                <w:color w:val="548DD4"/>
+                <w:sz w:val="18"/>
+                <w:szCs w:val="20"/>
+                <w:lang w:eastAsia="es-CL"/>
+              </w:rPr>
+            </w:pPr>
+            <w:r>
+              <w:rPr>
+                <w:rFonts w:ascii="Calibri" w:hAnsi="Calibri" w:cs="Arial"/>
+                <w:i/>
+                <w:color w:val="548DD4"/>
+                <w:sz w:val="18"/>
+                <w:szCs w:val="20"/>
+                <w:lang w:eastAsia="es-CL"/>
+              </w:rPr>
+              <w:t>SQL Server 2022, Docker, SQLAlchemy 2.0, Alembic, app/models/usuario.py, migrations/env.py, alembic.ini.</w:t>
+            </w:r>
+          </w:p>
+        </w:tc>
+        <w:tc>
+          <w:tcPr>
+            <w:tcW w:w="1276" w:type="dxa"/>
+          </w:tcPr>
+          <w:p>
+            <w:pPr>
+              <w:jc w:val="both"/>
+              <w:rPr>
+                <w:rFonts w:ascii="Calibri" w:hAnsi="Calibri" w:cs="Arial"/>
+                <w:i/>
+                <w:color w:val="548DD4"/>
+                <w:sz w:val="18"/>
+                <w:szCs w:val="20"/>
+                <w:lang w:eastAsia="es-CL"/>
+              </w:rPr>
+            </w:pPr>
+            <w:r>
+              <w:rPr>
+                <w:rFonts w:ascii="Calibri" w:hAnsi="Calibri" w:cs="Arial"/>
+                <w:i/>
+                <w:color w:val="548DD4"/>
+                <w:sz w:val="18"/>
+                <w:szCs w:val="20"/>
+                <w:lang w:eastAsia="es-CL"/>
+              </w:rPr>
+              <w:t>2 semanas.</w:t>
+            </w:r>
+          </w:p>
+        </w:tc>
+        <w:tc>
+          <w:tcPr>
+            <w:tcW w:w="1275" w:type="dxa"/>
+          </w:tcPr>
+          <w:p>
+            <w:pPr>
+              <w:jc w:val="both"/>
+              <w:rPr>
+                <w:rFonts w:ascii="Calibri" w:hAnsi="Calibri" w:cs="Arial"/>
+                <w:i/>
+                <w:color w:val="548DD4"/>
+                <w:sz w:val="18"/>
+                <w:szCs w:val="20"/>
+                <w:lang w:eastAsia="es-CL"/>
+              </w:rPr>
+            </w:pPr>
+            <w:r>
+              <w:rPr>
+                <w:rFonts w:ascii="Calibri" w:hAnsi="Calibri" w:cs="Arial"/>
+                <w:i/>
+                <w:color w:val="548DD4"/>
+                <w:sz w:val="18"/>
+                <w:szCs w:val="20"/>
+                <w:lang w:eastAsia="es-CL"/>
+              </w:rPr>
+              <w:t>Todo el Equipo</w:t>
+            </w:r>
+          </w:p>
+        </w:tc>
+        <w:tc>
+          <w:tcPr>
+            <w:tcW w:w="1276" w:type="dxa"/>
+          </w:tcPr>
+          <w:p>
+            <w:pPr>
+              <w:jc w:val="both"/>
+              <w:rPr>
+                <w:rFonts w:ascii="Calibri" w:hAnsi="Calibri" w:cs="Arial"/>
+                <w:i/>
+                <w:color w:val="548DD4"/>
+                <w:sz w:val="18"/>
+                <w:szCs w:val="20"/>
+                <w:lang w:eastAsia="es-CL"/>
+              </w:rPr>
+            </w:pPr>
+            <w:r>
+              <w:rPr>
+                <w:rFonts w:ascii="Calibri" w:hAnsi="Calibri" w:cs="Arial"/>
+                <w:i/>
+                <w:color w:val="548DD4"/>
+                <w:sz w:val="18"/>
+                <w:szCs w:val="20"/>
+                <w:lang w:eastAsia="es-CL"/>
+              </w:rPr>
+              <w:t>La migración inicial crea usuarios, usuario_roles y alembic_version.</w:t>
+            </w:r>
+          </w:p>
+        </w:tc>
+        <w:tc>
+          <w:tcPr>
+            <w:tcW w:w="1418" w:type="dxa"/>
+          </w:tcPr>
+          <w:p>
+            <w:pPr>
+              <w:jc w:val="both"/>
+              <w:rPr>
+                <w:rFonts w:ascii="Calibri" w:hAnsi="Calibri" w:cs="Arial"/>
+                <w:b/>
+                <w:bCs/>
+                <w:i/>
+                <w:color w:val="548DD4"/>
+                <w:sz w:val="18"/>
+                <w:szCs w:val="20"/>
+                <w:lang w:eastAsia="es-CL"/>
+              </w:rPr>
+            </w:pPr>
+            <w:r>
+              <w:rPr>
+                <w:rFonts w:ascii="Calibri" w:hAnsi="Calibri" w:cs="Arial"/>
+                <w:b/>
+                <w:bCs/>
+                <w:i/>
+                <w:color w:val="548DD4"/>
+                <w:sz w:val="18"/>
+                <w:szCs w:val="20"/>
+                <w:lang w:eastAsia="es-CL"/>
+              </w:rPr>
+              <w:t>Completada para E1. La migración inicial está versionada y documentada.</w:t>
+            </w:r>
+          </w:p>
+        </w:tc>
+        <w:tc>
+          <w:tcPr>
+            <w:tcW w:w="850" w:type="dxa"/>
+          </w:tcPr>
+          <w:p>
+            <w:pPr>
+              <w:jc w:val="both"/>
+              <w:rPr>
+                <w:rFonts w:ascii="Calibri" w:hAnsi="Calibri" w:cs="Arial"/>
+                <w:i/>
+                <w:color w:val="548DD4"/>
+                <w:sz w:val="18"/>
+                <w:szCs w:val="20"/>
+                <w:lang w:eastAsia="es-CL"/>
+              </w:rPr>
+            </w:pPr>
+            <w:r>
+              <w:rPr>
+                <w:rFonts w:ascii="Calibri" w:hAnsi="Calibri" w:cs="Arial"/>
+                <w:i/>
+                <w:color w:val="548DD4"/>
+                <w:sz w:val="18"/>
+                <w:szCs w:val="20"/>
+                <w:lang w:eastAsia="es-CL"/>
+              </w:rPr>
+              <w:t>Se decidió utilizar SQL Server desde el comienzo y no SQLite. Las nuevas entidades de E2, E3 y E4 se agregarán mediante nuevas migraciones.</w:t>
+            </w:r>
+          </w:p>
+        </w:tc>
+      </w:tr>
+      <w:tr>
+        <w:trPr>
+          <w:trHeight w:val="2410"/>
+        </w:trPr>
+        <w:tc>
+          <w:tcPr>
+            <w:tcW w:w="1328" w:type="dxa"/>
+          </w:tcPr>
+          <w:p>
+            <w:pPr>
+              <w:jc w:val="both"/>
+              <w:rPr>
+                <w:rFonts w:ascii="Calibri" w:hAnsi="Calibri" w:cs="Arial"/>
+                <w:b/>
+                <w:bCs/>
+                <w:i/>
+                <w:color w:val="548DD4"/>
+                <w:sz w:val="18"/>
+                <w:szCs w:val="20"/>
+                <w:lang w:eastAsia="es-CL"/>
+              </w:rPr>
+            </w:pPr>
+            <w:r>
+              <w:rPr>
+                <w:rFonts w:ascii="Calibri" w:hAnsi="Calibri" w:cs="Arial"/>
+                <w:b/>
+                <w:bCs/>
+                <w:i/>
+                <w:color w:val="548DD4"/>
+                <w:sz w:val="18"/>
+                <w:szCs w:val="20"/>
+                <w:lang w:eastAsia="es-CL"/>
+              </w:rPr>
+              <w:lastRenderedPageBreak/>
+              <w:t>Realizar pruebas funcionales, de integración y de seguridad.</w:t>
+            </w:r>
+          </w:p>
+        </w:tc>
+        <w:tc>
+          <w:tcPr>
+            <w:tcW w:w="1077" w:type="dxa"/>
+          </w:tcPr>
+          <w:p>
+            <w:pPr>
+              <w:jc w:val="both"/>
+              <w:rPr>
+                <w:rFonts w:ascii="Calibri" w:hAnsi="Calibri" w:cs="Arial"/>
+                <w:i/>
+                <w:color w:val="548DD4"/>
+                <w:sz w:val="18"/>
+                <w:szCs w:val="20"/>
+                <w:lang w:eastAsia="es-CL"/>
+              </w:rPr>
+            </w:pPr>
+            <w:r>
+              <w:rPr>
+                <w:rFonts w:ascii="Calibri" w:hAnsi="Calibri" w:cs="Arial"/>
+                <w:i/>
+                <w:color w:val="548DD4"/>
+                <w:sz w:val="18"/>
+                <w:szCs w:val="20"/>
+                <w:lang w:eastAsia="es-CL"/>
+              </w:rPr>
+              <w:t xml:space="preserve">Probar /health, login correcto e incorrecto, usuarios desactivados, roles, creación de usuarios, contraseñas cifradas y respuestas sin </w:t>
+            </w:r>
+            <w:proofErr w:type="gramStart"/>
+            <w:r>
+              <w:rPr>
+                <w:rFonts w:ascii="Calibri" w:hAnsi="Calibri" w:cs="Arial"/>
+                <w:i/>
+                <w:color w:val="548DD4"/>
+                <w:sz w:val="18"/>
+                <w:szCs w:val="20"/>
+                <w:lang w:eastAsia="es-CL"/>
+              </w:rPr>
+              <w:t>password</w:t>
+            </w:r>
+            <w:proofErr w:type="gramEnd"/>
+            <w:r>
+              <w:rPr>
+                <w:rFonts w:ascii="Calibri" w:hAnsi="Calibri" w:cs="Arial"/>
+                <w:i/>
+                <w:color w:val="548DD4"/>
+                <w:sz w:val="18"/>
+                <w:szCs w:val="20"/>
+                <w:lang w:eastAsia="es-CL"/>
+              </w:rPr>
+              <w:t>_hash.</w:t>
+            </w:r>
+          </w:p>
+        </w:tc>
+        <w:tc>
+          <w:tcPr>
+            <w:tcW w:w="1276" w:type="dxa"/>
+          </w:tcPr>
+          <w:p>
+            <w:pPr>
+              <w:jc w:val="both"/>
+              <w:rPr>
+                <w:rFonts w:ascii="Calibri" w:hAnsi="Calibri" w:cs="Arial"/>
+                <w:i/>
+                <w:color w:val="548DD4"/>
+                <w:sz w:val="18"/>
+                <w:szCs w:val="20"/>
+                <w:lang w:eastAsia="es-CL"/>
+              </w:rPr>
+            </w:pPr>
+            <w:r>
+              <w:rPr>
+                <w:rFonts w:ascii="Calibri" w:hAnsi="Calibri" w:cs="Arial"/>
+                <w:i/>
+                <w:color w:val="548DD4"/>
+                <w:sz w:val="18"/>
+                <w:szCs w:val="20"/>
+                <w:lang w:eastAsia="es-CL"/>
+              </w:rPr>
+              <w:t>Docker, FastAPI, pruebas en sistema/backend/tests/, documento Resultados_Pruebas_E1_2026-10-03.md.</w:t>
+            </w:r>
+          </w:p>
+        </w:tc>
+        <w:tc>
+          <w:tcPr>
+            <w:tcW w:w="1276" w:type="dxa"/>
+          </w:tcPr>
+          <w:p>
+            <w:pPr>
+              <w:jc w:val="both"/>
+              <w:rPr>
+                <w:rFonts w:ascii="Calibri" w:hAnsi="Calibri" w:cs="Arial"/>
+                <w:i/>
+                <w:color w:val="548DD4"/>
+                <w:sz w:val="18"/>
+                <w:szCs w:val="20"/>
+                <w:lang w:eastAsia="es-CL"/>
+              </w:rPr>
+            </w:pPr>
+            <w:r>
+              <w:rPr>
+                <w:rFonts w:ascii="Calibri" w:hAnsi="Calibri" w:cs="Arial"/>
+                <w:i/>
+                <w:color w:val="548DD4"/>
+                <w:sz w:val="18"/>
+                <w:szCs w:val="20"/>
+                <w:lang w:eastAsia="es-CL"/>
+              </w:rPr>
+              <w:t xml:space="preserve">Semana 1 y 2 luego de cada </w:t>
+            </w:r>
+            <w:r>
+              <w:rPr>
+                <w:rFonts w:ascii="Calibri" w:hAnsi="Calibri" w:cs="Arial"/>
+                <w:i/>
+                <w:color w:val="548DD4"/>
+                <w:sz w:val="18"/>
+                <w:szCs w:val="20"/>
+                <w:lang w:eastAsia="es-CL"/>
+              </w:rPr>
+              <w:t>épica</w:t>
+            </w:r>
+          </w:p>
+        </w:tc>
+        <w:tc>
+          <w:tcPr>
+            <w:tcW w:w="1275" w:type="dxa"/>
+          </w:tcPr>
+          <w:p>
+            <w:pPr>
+              <w:jc w:val="both"/>
+              <w:rPr>
+                <w:rFonts w:ascii="Calibri" w:hAnsi="Calibri" w:cs="Arial"/>
+                <w:i/>
+                <w:color w:val="548DD4"/>
+                <w:sz w:val="18"/>
+                <w:szCs w:val="20"/>
+                <w:lang w:eastAsia="es-CL"/>
+              </w:rPr>
+            </w:pPr>
+            <w:r>
+              <w:rPr>
+                <w:rFonts w:ascii="Calibri" w:hAnsi="Calibri" w:cs="Arial"/>
+                <w:i/>
+                <w:color w:val="548DD4"/>
+                <w:sz w:val="18"/>
+                <w:szCs w:val="20"/>
+                <w:lang w:eastAsia="es-CL"/>
+              </w:rPr>
+              <w:t>Todo el equipo</w:t>
+            </w:r>
+          </w:p>
+        </w:tc>
+        <w:tc>
+          <w:tcPr>
+            <w:tcW w:w="1276" w:type="dxa"/>
+          </w:tcPr>
+          <w:p>
+            <w:pPr>
+              <w:jc w:val="both"/>
+              <w:rPr>
+                <w:rFonts w:ascii="Calibri" w:hAnsi="Calibri" w:cs="Arial"/>
+                <w:i/>
+                <w:color w:val="548DD4"/>
+                <w:sz w:val="18"/>
+                <w:szCs w:val="20"/>
+                <w:lang w:eastAsia="es-CL"/>
+              </w:rPr>
+            </w:pPr>
+            <w:r>
+              <w:rPr>
+                <w:rFonts w:ascii="Calibri" w:hAnsi="Calibri" w:cs="Arial"/>
+                <w:i/>
+                <w:color w:val="548DD4"/>
+                <w:sz w:val="18"/>
+                <w:szCs w:val="20"/>
+                <w:lang w:eastAsia="es-CL"/>
+              </w:rPr>
+              <w:t>Las pruebas deben ejecutarse dentro de Docker para asegurar que sean reproducibles.</w:t>
+            </w:r>
+          </w:p>
+        </w:tc>
+        <w:tc>
+          <w:tcPr>
+            <w:tcW w:w="1418" w:type="dxa"/>
+          </w:tcPr>
+          <w:p>
+            <w:pPr>
+              <w:jc w:val="both"/>
+              <w:rPr>
+                <w:rFonts w:ascii="Calibri" w:hAnsi="Calibri" w:cs="Arial"/>
+                <w:b/>
+                <w:bCs/>
+                <w:i/>
+                <w:color w:val="548DD4"/>
+                <w:sz w:val="18"/>
+                <w:szCs w:val="20"/>
+                <w:lang w:eastAsia="es-CL"/>
+              </w:rPr>
+            </w:pPr>
+            <w:r>
+              <w:rPr>
+                <w:rFonts w:ascii="Calibri" w:hAnsi="Calibri" w:cs="Arial"/>
+                <w:b/>
+                <w:bCs/>
+                <w:i/>
+                <w:color w:val="548DD4"/>
+                <w:sz w:val="18"/>
+                <w:szCs w:val="20"/>
+                <w:lang w:eastAsia="es-CL"/>
+              </w:rPr>
+              <w:t>Completada para el backend de E1. Se documentaron los criterios HTTP y se verificaron las dependencias de autenticación.</w:t>
+            </w:r>
+          </w:p>
+        </w:tc>
+        <w:tc>
+          <w:tcPr>
+            <w:tcW w:w="850" w:type="dxa"/>
+          </w:tcPr>
+          <w:p>
+            <w:pPr>
+              <w:jc w:val="both"/>
+              <w:rPr>
+                <w:rFonts w:ascii="Calibri" w:hAnsi="Calibri" w:cs="Arial"/>
+                <w:i/>
+                <w:color w:val="548DD4"/>
+                <w:sz w:val="18"/>
+                <w:szCs w:val="20"/>
+                <w:lang w:eastAsia="es-CL"/>
+              </w:rPr>
+            </w:pPr>
+            <w:r>
+              <w:rPr>
+                <w:rFonts w:ascii="Calibri" w:hAnsi="Calibri" w:cs="Arial"/>
+                <w:i/>
+                <w:color w:val="548DD4"/>
+                <w:sz w:val="18"/>
+                <w:szCs w:val="20"/>
+                <w:lang w:eastAsia="es-CL"/>
+              </w:rPr>
+              <w:t>Las pruebas del frontend y de los módulos E2–E4 quedan pendientes.</w:t>
+            </w:r>
+          </w:p>
+        </w:tc>
+      </w:tr>
+      <w:tr>
+        <w:trPr>
+          <w:trHeight w:val="2410"/>
+        </w:trPr>
+        <w:tc>
+          <w:tcPr>
+            <w:tcW w:w="1328" w:type="dxa"/>
+          </w:tcPr>
+          <w:p>
+            <w:pPr>
+              <w:jc w:val="both"/>
+              <w:rPr>
+                <w:rFonts w:ascii="Calibri" w:hAnsi="Calibri" w:cs="Arial"/>
+                <w:b/>
+                <w:bCs/>
+                <w:i/>
+                <w:color w:val="548DD4"/>
+                <w:sz w:val="18"/>
+                <w:szCs w:val="20"/>
+                <w:lang w:eastAsia="es-CL"/>
+              </w:rPr>
+            </w:pPr>
+            <w:r>
+              <w:rPr>
+                <w:rFonts w:ascii="Calibri" w:hAnsi="Calibri" w:cs="Arial"/>
+                <w:b/>
+                <w:bCs/>
+                <w:i/>
+                <w:color w:val="548DD4"/>
+                <w:sz w:val="18"/>
+                <w:szCs w:val="20"/>
+                <w:lang w:eastAsia="es-CL"/>
+              </w:rPr>
+              <w:t>Desarrollar el frontend para autenticación y navegación inicial.</w:t>
+            </w:r>
+          </w:p>
+        </w:tc>
+        <w:tc>
+          <w:tcPr>
+            <w:tcW w:w="1077" w:type="dxa"/>
+          </w:tcPr>
+          <w:p>
+            <w:pPr>
+              <w:jc w:val="both"/>
+              <w:rPr>
+                <w:rFonts w:ascii="Calibri" w:hAnsi="Calibri" w:cs="Arial"/>
+                <w:i/>
+                <w:color w:val="548DD4"/>
+                <w:sz w:val="18"/>
+                <w:szCs w:val="20"/>
+                <w:lang w:eastAsia="es-CL"/>
+              </w:rPr>
+            </w:pPr>
+            <w:r>
+              <w:rPr>
+                <w:rFonts w:ascii="Calibri" w:hAnsi="Calibri" w:cs="Arial"/>
+                <w:i/>
+                <w:color w:val="548DD4"/>
+                <w:sz w:val="18"/>
+                <w:szCs w:val="20"/>
+                <w:lang w:eastAsia="es-CL"/>
+              </w:rPr>
+              <w:t>Crear el proyecto React/Vite/Tailwind, pantalla de login, almacenamiento temporal del token, consulta de /auth/me, cierre de sesión y rutas protegidas.</w:t>
+            </w:r>
+          </w:p>
+        </w:tc>
+        <w:tc>
+          <w:tcPr>
+            <w:tcW w:w="1276" w:type="dxa"/>
+          </w:tcPr>
+          <w:p>
+            <w:pPr>
+              <w:jc w:val="both"/>
+              <w:rPr>
+                <w:rFonts w:ascii="Calibri" w:hAnsi="Calibri" w:cs="Arial"/>
+                <w:i/>
+                <w:color w:val="548DD4"/>
+                <w:sz w:val="18"/>
+                <w:szCs w:val="20"/>
+                <w:lang w:eastAsia="es-CL"/>
+              </w:rPr>
+            </w:pPr>
+            <w:r>
+              <w:rPr>
+                <w:rFonts w:ascii="Calibri" w:hAnsi="Calibri" w:cs="Arial"/>
+                <w:i/>
+                <w:color w:val="548DD4"/>
+                <w:sz w:val="18"/>
+                <w:szCs w:val="20"/>
+                <w:lang w:eastAsia="es-CL"/>
+              </w:rPr>
+              <w:t>React, Vite, Tailwind, Axios, React Router, Docker, guía Guia_Frontend_Login_E1_2026-10-03.md.</w:t>
+            </w:r>
+          </w:p>
+        </w:tc>
+        <w:tc>
+          <w:tcPr>
+            <w:tcW w:w="1276" w:type="dxa"/>
+          </w:tcPr>
+          <w:p>
+            <w:pPr>
+              <w:jc w:val="both"/>
+              <w:rPr>
+                <w:rFonts w:ascii="Calibri" w:hAnsi="Calibri" w:cs="Arial"/>
+                <w:i/>
+                <w:color w:val="548DD4"/>
+                <w:sz w:val="18"/>
+                <w:szCs w:val="20"/>
+                <w:lang w:eastAsia="es-CL"/>
+              </w:rPr>
+            </w:pPr>
+            <w:r>
+              <w:rPr>
+                <w:rFonts w:ascii="Calibri" w:hAnsi="Calibri" w:cs="Arial"/>
+                <w:i/>
+                <w:color w:val="548DD4"/>
+                <w:sz w:val="18"/>
+                <w:szCs w:val="20"/>
+                <w:lang w:eastAsia="es-CL"/>
+              </w:rPr>
+              <w:t>2 semanas</w:t>
+            </w:r>
+          </w:p>
+        </w:tc>
+        <w:tc>
+          <w:tcPr>
+            <w:tcW w:w="1275" w:type="dxa"/>
+          </w:tcPr>
+          <w:p>
+            <w:pPr>
+              <w:jc w:val="both"/>
+              <w:rPr>
+                <w:rFonts w:ascii="Calibri" w:hAnsi="Calibri" w:cs="Arial"/>
+                <w:i/>
+                <w:color w:val="548DD4"/>
+                <w:sz w:val="18"/>
+                <w:szCs w:val="20"/>
+                <w:lang w:eastAsia="es-CL"/>
+              </w:rPr>
+            </w:pPr>
+            <w:r>
+              <w:rPr>
+                <w:rFonts w:ascii="Calibri" w:hAnsi="Calibri" w:cs="Arial"/>
+                <w:i/>
+                <w:color w:val="548DD4"/>
+                <w:sz w:val="18"/>
+                <w:szCs w:val="20"/>
+                <w:lang w:eastAsia="es-CL"/>
+              </w:rPr>
+              <w:t>Todo el equipo</w:t>
+            </w:r>
+          </w:p>
+        </w:tc>
+        <w:tc>
+          <w:tcPr>
+            <w:tcW w:w="1276" w:type="dxa"/>
+          </w:tcPr>
+          <w:p>
+            <w:pPr>
+              <w:jc w:val="both"/>
+              <w:rPr>
+                <w:rFonts w:ascii="Calibri" w:hAnsi="Calibri" w:cs="Arial"/>
+                <w:i/>
+                <w:color w:val="548DD4"/>
+                <w:sz w:val="18"/>
+                <w:szCs w:val="20"/>
+                <w:lang w:eastAsia="es-CL"/>
+              </w:rPr>
+            </w:pPr>
+            <w:r>
+              <w:rPr>
+                <w:rFonts w:ascii="Calibri" w:hAnsi="Calibri" w:cs="Arial"/>
+                <w:i/>
+                <w:color w:val="548DD4"/>
+                <w:sz w:val="18"/>
+                <w:szCs w:val="20"/>
+                <w:lang w:eastAsia="es-CL"/>
+              </w:rPr>
+              <w:t xml:space="preserve">El frontend </w:t>
+            </w:r>
+            <w:r>
+              <w:rPr>
+                <w:rFonts w:ascii="Calibri" w:hAnsi="Calibri" w:cs="Arial"/>
+                <w:i/>
+                <w:color w:val="548DD4"/>
+                <w:sz w:val="18"/>
+                <w:szCs w:val="20"/>
+                <w:lang w:eastAsia="es-CL"/>
+              </w:rPr>
+              <w:t>se</w:t>
+            </w:r>
+            <w:r>
+              <w:rPr>
+                <w:rFonts w:ascii="Calibri" w:hAnsi="Calibri" w:cs="Arial"/>
+                <w:i/>
+                <w:color w:val="548DD4"/>
+                <w:sz w:val="18"/>
+                <w:szCs w:val="20"/>
+                <w:lang w:eastAsia="es-CL"/>
+              </w:rPr>
+              <w:t xml:space="preserve"> comunicarse con http://localhost:8000 desde el navegador.</w:t>
+            </w:r>
+          </w:p>
+        </w:tc>
+        <w:tc>
+          <w:tcPr>
+            <w:tcW w:w="1418" w:type="dxa"/>
+          </w:tcPr>
+          <w:p>
+            <w:pPr>
+              <w:jc w:val="both"/>
+              <w:rPr>
+                <w:rFonts w:ascii="Calibri" w:hAnsi="Calibri" w:cs="Arial"/>
+                <w:b/>
+                <w:bCs/>
+                <w:i/>
+                <w:color w:val="548DD4"/>
+                <w:sz w:val="18"/>
+                <w:szCs w:val="20"/>
+                <w:lang w:eastAsia="es-CL"/>
+              </w:rPr>
+            </w:pPr>
+            <w:r>
+              <w:rPr>
+                <w:rFonts w:ascii="Calibri" w:hAnsi="Calibri" w:cs="Arial"/>
+                <w:b/>
+                <w:bCs/>
+                <w:i/>
+                <w:color w:val="548DD4"/>
+                <w:sz w:val="18"/>
+                <w:szCs w:val="20"/>
+                <w:lang w:eastAsia="es-CL"/>
+              </w:rPr>
+              <w:t>Completada</w:t>
+            </w:r>
+          </w:p>
+        </w:tc>
+        <w:tc>
+          <w:tcPr>
+            <w:tcW w:w="850" w:type="dxa"/>
+          </w:tcPr>
+          <w:p>
+            <w:pPr>
+              <w:jc w:val="both"/>
+              <w:rPr>
+                <w:rFonts w:ascii="Calibri" w:hAnsi="Calibri" w:cs="Arial"/>
+                <w:i/>
+                <w:color w:val="548DD4"/>
+                <w:sz w:val="18"/>
+                <w:szCs w:val="20"/>
+                <w:lang w:eastAsia="es-CL"/>
+              </w:rPr>
+            </w:pPr>
+            <w:r>
+              <w:rPr>
+                <w:rFonts w:ascii="Calibri" w:hAnsi="Calibri" w:cs="Arial"/>
+                <w:i/>
+                <w:color w:val="548DD4"/>
+                <w:sz w:val="18"/>
+                <w:szCs w:val="20"/>
+                <w:lang w:eastAsia="es-CL"/>
+              </w:rPr>
+              <w:t xml:space="preserve">Se documentó el frontend como actividad </w:t>
+            </w:r>
+            <w:r>
+              <w:rPr>
+                <w:rFonts w:ascii="Calibri" w:hAnsi="Calibri" w:cs="Arial"/>
+                <w:i/>
+                <w:color w:val="548DD4"/>
+                <w:sz w:val="18"/>
+                <w:szCs w:val="20"/>
+                <w:lang w:eastAsia="es-CL"/>
+              </w:rPr>
+              <w:t>completa</w:t>
+            </w:r>
+            <w:r>
+              <w:rPr>
+                <w:rFonts w:ascii="Calibri" w:hAnsi="Calibri" w:cs="Arial"/>
+                <w:i/>
+                <w:color w:val="548DD4"/>
+                <w:sz w:val="18"/>
+                <w:szCs w:val="20"/>
+                <w:lang w:eastAsia="es-CL"/>
+              </w:rPr>
+              <w:t>.</w:t>
             </w:r>
           </w:p>
         </w:tc>
@@ -2414,94 +3434,21 @@
               </w:rPr>
               <w:t xml:space="preserve">: </w:t>
             </w:r>
-            <w:r>
-              <w:rPr>
-                <w:rFonts w:ascii="Calibri" w:hAnsi="Calibri" w:cs="Arial"/>
-                <w:i/>
-                <w:iCs/>
-                <w:color w:val="548DD4"/>
-                <w:sz w:val="20"/>
-                <w:szCs w:val="20"/>
-                <w:lang w:eastAsia="es-CL"/>
-              </w:rPr>
-              <w:t>Describe los factores que han facilitado y</w:t>
-            </w:r>
-            <w:r>
-              <w:rPr>
-                <w:rFonts w:ascii="Calibri" w:hAnsi="Calibri" w:cs="Arial"/>
-                <w:i/>
-                <w:iCs/>
-                <w:color w:val="548DD4"/>
-                <w:sz w:val="20"/>
-                <w:szCs w:val="20"/>
-                <w:lang w:eastAsia="es-CL"/>
-              </w:rPr>
-              <w:t>/o</w:t>
-            </w:r>
-            <w:r>
-              <w:rPr>
-                <w:rFonts w:ascii="Calibri" w:hAnsi="Calibri" w:cs="Arial"/>
-                <w:i/>
-                <w:iCs/>
-                <w:color w:val="548DD4"/>
-                <w:sz w:val="20"/>
-                <w:szCs w:val="20"/>
-                <w:lang w:eastAsia="es-CL"/>
-              </w:rPr>
-              <w:t xml:space="preserve"> dificultado el desarrollo de tu Proyecto APT hasta ahora. En el caso de las dificultades</w:t>
-            </w:r>
-            <w:r>
-              <w:rPr>
-                <w:rFonts w:ascii="Calibri" w:hAnsi="Calibri" w:cs="Arial"/>
-                <w:i/>
-                <w:iCs/>
-                <w:color w:val="548DD4"/>
-                <w:sz w:val="20"/>
-                <w:szCs w:val="20"/>
-                <w:lang w:eastAsia="es-CL"/>
-              </w:rPr>
-              <w:t xml:space="preserve"> debes describir</w:t>
-            </w:r>
-            <w:r>
-              <w:rPr>
-                <w:rFonts w:ascii="Calibri" w:hAnsi="Calibri" w:cs="Arial"/>
-                <w:i/>
-                <w:iCs/>
-                <w:color w:val="548DD4"/>
-                <w:sz w:val="20"/>
-                <w:szCs w:val="20"/>
-                <w:lang w:eastAsia="es-CL"/>
-              </w:rPr>
-              <w:t xml:space="preserve"> qué acciones tomaste y/o tomarás para </w:t>
-            </w:r>
-            <w:r>
-              <w:rPr>
-                <w:rFonts w:ascii="Calibri" w:hAnsi="Calibri" w:cs="Arial"/>
-                <w:i/>
-                <w:iCs/>
-                <w:color w:val="548DD4"/>
-                <w:sz w:val="20"/>
-                <w:szCs w:val="20"/>
-                <w:lang w:eastAsia="es-CL"/>
-              </w:rPr>
-              <w:t xml:space="preserve">solucionarlas. </w:t>
-            </w:r>
-            <w:r>
+          </w:p>
+          <w:p>
+            <w:pPr>
               <w:rPr>
                 <w:rFonts w:ascii="Calibri" w:hAnsi="Calibri"/>
-                <w:b/>
-                <w:color w:val="1F3864" w:themeColor="accent1" w:themeShade="80"/>
-              </w:rPr>
-              <w:t xml:space="preserve"> </w:t>
-            </w:r>
-          </w:p>
-          <w:p>
-            <w:pPr>
+                <w:color w:val="0070C0"/>
+              </w:rPr>
+            </w:pPr>
+            <w:r>
               <w:rPr>
                 <w:rFonts w:ascii="Calibri" w:hAnsi="Calibri"/>
-                <w:color w:val="1F3864" w:themeColor="accent1" w:themeShade="80"/>
-              </w:rPr>
-            </w:pPr>
+                <w:color w:val="0070C0"/>
+              </w:rPr>
+              <w:t>El principal problema ha sido los tiempos de trabajo, si bien gracias a la metodología ágil todos podemos avanzar de forma autónoma, hay ocasiones en las que debemos reunirnos para solucionar dudas o apoyar en tareas que han sido postergadas.</w:t>
+            </w:r>
           </w:p>
           <w:p>
             <w:pPr>
@@ -2608,122 +3555,77 @@
                 <w:rFonts w:ascii="Calibri" w:hAnsi="Calibri"/>
                 <w:color w:val="1F3864" w:themeColor="accent1" w:themeShade="80"/>
               </w:rPr>
-              <w:lastRenderedPageBreak/>
-              <w:t xml:space="preserve">Actividades ajustadas o eliminadas: </w:t>
-            </w:r>
-            <w:r>
-              <w:rPr>
-                <w:rFonts w:ascii="Calibri" w:hAnsi="Calibri" w:cs="Arial"/>
-                <w:i/>
-                <w:color w:val="548DD4"/>
-                <w:sz w:val="20"/>
-                <w:szCs w:val="20"/>
-                <w:lang w:eastAsia="es-CL"/>
-              </w:rPr>
-              <w:t>Señalar los ajustes</w:t>
-            </w:r>
-            <w:r>
-              <w:rPr>
-                <w:rFonts w:ascii="Calibri" w:hAnsi="Calibri" w:cs="Arial"/>
-                <w:i/>
-                <w:color w:val="548DD4"/>
-                <w:sz w:val="20"/>
-                <w:szCs w:val="20"/>
-                <w:lang w:eastAsia="es-CL"/>
-              </w:rPr>
-              <w:t xml:space="preserve"> que realizaste a tu plan de trabajo o </w:t>
-            </w:r>
-            <w:r>
-              <w:rPr>
-                <w:rFonts w:ascii="Calibri" w:hAnsi="Calibri" w:cs="Arial"/>
-                <w:i/>
-                <w:color w:val="548DD4"/>
-                <w:sz w:val="20"/>
-                <w:szCs w:val="20"/>
-                <w:lang w:eastAsia="es-CL"/>
-              </w:rPr>
-              <w:t>actividades que</w:t>
-            </w:r>
-            <w:r>
-              <w:rPr>
-                <w:rFonts w:ascii="Calibri" w:hAnsi="Calibri" w:cs="Arial"/>
-                <w:i/>
-                <w:color w:val="548DD4"/>
-                <w:sz w:val="20"/>
-                <w:szCs w:val="20"/>
-                <w:lang w:eastAsia="es-CL"/>
-              </w:rPr>
-              <w:t xml:space="preserve"> eliminaste</w:t>
-            </w:r>
-            <w:r>
-              <w:rPr>
-                <w:rFonts w:ascii="Calibri" w:hAnsi="Calibri" w:cs="Arial"/>
-                <w:i/>
-                <w:color w:val="548DD4"/>
-                <w:sz w:val="20"/>
-                <w:szCs w:val="20"/>
-                <w:lang w:eastAsia="es-CL"/>
-              </w:rPr>
-              <w:t xml:space="preserve"> y</w:t>
-            </w:r>
-            <w:r>
-              <w:rPr>
-                <w:rFonts w:ascii="Calibri" w:hAnsi="Calibri" w:cs="Arial"/>
-                <w:i/>
-                <w:color w:val="548DD4"/>
-                <w:sz w:val="20"/>
-                <w:szCs w:val="20"/>
-                <w:lang w:eastAsia="es-CL"/>
-              </w:rPr>
-              <w:t>,</w:t>
-            </w:r>
-            <w:r>
-              <w:rPr>
-                <w:rFonts w:ascii="Calibri" w:hAnsi="Calibri" w:cs="Arial"/>
-                <w:i/>
-                <w:color w:val="548DD4"/>
-                <w:sz w:val="20"/>
-                <w:szCs w:val="20"/>
-                <w:lang w:eastAsia="es-CL"/>
-              </w:rPr>
-              <w:t xml:space="preserve"> justifica por</w:t>
-            </w:r>
-            <w:r>
-              <w:rPr>
-                <w:rFonts w:ascii="Calibri" w:hAnsi="Calibri" w:cs="Arial"/>
-                <w:i/>
-                <w:color w:val="548DD4"/>
-                <w:sz w:val="20"/>
-                <w:szCs w:val="20"/>
-                <w:lang w:eastAsia="es-CL"/>
-              </w:rPr>
-              <w:t xml:space="preserve"> </w:t>
-            </w:r>
-            <w:r>
-              <w:rPr>
-                <w:rFonts w:ascii="Calibri" w:hAnsi="Calibri" w:cs="Arial"/>
-                <w:i/>
-                <w:color w:val="548DD4"/>
-                <w:sz w:val="20"/>
-                <w:szCs w:val="20"/>
-                <w:lang w:eastAsia="es-CL"/>
-              </w:rPr>
-              <w:t xml:space="preserve">qué lo hiciste. </w:t>
-            </w:r>
-            <w:r>
-              <w:t xml:space="preserve"> </w:t>
-            </w:r>
-            <w:r>
-              <w:rPr>
-                <w:rFonts w:ascii="Calibri" w:hAnsi="Calibri" w:cs="Arial"/>
-                <w:i/>
-                <w:color w:val="548DD4"/>
-                <w:sz w:val="20"/>
-                <w:szCs w:val="20"/>
-                <w:lang w:eastAsia="es-CL"/>
-              </w:rPr>
-              <w:t>En el caso de que tu plan de trabajo no haya requerido ni requiera ajustes, justifica esta decisión a partir de los facilitadores que te han permitido desarrollarlo como fue planeado.</w:t>
-            </w:r>
+              <w:t>Actividades ajustadas o eliminadas:</w:t>
+            </w:r>
+          </w:p>
+          <w:p>
+            <w:pPr>
+              <w:numPr>
+                <w:ilvl w:val="0"/>
+                <w:numId w:val="4"/>
+              </w:numPr>
+              <w:jc w:val="both"/>
+              <w:rPr>
+                <w:rFonts w:ascii="Calibri" w:hAnsi="Calibri" w:cs="Arial"/>
+                <w:i/>
+                <w:color w:val="548DD4"/>
+                <w:sz w:val="20"/>
+                <w:szCs w:val="20"/>
+                <w:lang w:val="es-419" w:eastAsia="es-CL"/>
+              </w:rPr>
+            </w:pPr>
+            <w:r>
+              <w:rPr>
+                <w:rFonts w:ascii="Calibri" w:hAnsi="Calibri" w:cs="Arial"/>
+                <w:i/>
+                <w:color w:val="548DD4"/>
+                <w:sz w:val="20"/>
+                <w:szCs w:val="20"/>
+                <w:lang w:val="es-419" w:eastAsia="es-CL"/>
+              </w:rPr>
+              <w:t>Se eliminaron del alcance los módulos de bodega, despacho y reportes de gestión, para cumplir con las cuatro épicas en el periodo académico.</w:t>
+            </w:r>
+          </w:p>
+          <w:p>
+            <w:pPr>
+              <w:numPr>
+                <w:ilvl w:val="0"/>
+                <w:numId w:val="4"/>
+              </w:numPr>
+              <w:jc w:val="both"/>
+              <w:rPr>
+                <w:rFonts w:ascii="Calibri" w:hAnsi="Calibri" w:cs="Arial"/>
+                <w:i/>
+                <w:color w:val="548DD4"/>
+                <w:sz w:val="20"/>
+                <w:szCs w:val="20"/>
+                <w:lang w:val="es-419" w:eastAsia="es-CL"/>
+              </w:rPr>
+            </w:pPr>
+            <w:r>
+              <w:rPr>
+                <w:rFonts w:ascii="Calibri" w:hAnsi="Calibri" w:cs="Arial"/>
+                <w:i/>
+                <w:color w:val="548DD4"/>
+                <w:sz w:val="20"/>
+                <w:szCs w:val="20"/>
+                <w:lang w:val="es-419" w:eastAsia="es-CL"/>
+              </w:rPr>
+              <w:t>Se definieron cuatro roles del sistema en lugar de "Operador y Administrador". Se descartaron los roles futuros "Productor externo" y "Cliente", porque un administrador podría asignarlos sin que existieran permisos para ellos. Se agregarán con una migración cuando se necesiten.</w:t>
+            </w:r>
+          </w:p>
+          <w:p>
+            <w:pPr>
+              <w:jc w:val="both"/>
+              <w:rPr>
+                <w:rFonts w:ascii="Calibri" w:hAnsi="Calibri" w:cs="Arial"/>
+                <w:i/>
+                <w:color w:val="548DD4"/>
+                <w:sz w:val="20"/>
+                <w:szCs w:val="20"/>
+                <w:lang w:eastAsia="es-CL"/>
+              </w:rPr>
+            </w:pPr>
           </w:p>
           <w:p>
             <w:pPr>
@@ -3525,6 +4427,155 @@
 <file path=word/numbering.xml><?xml version="1.0" encoding="utf-8"?>
 <w:numbering xmlns:wpc="http://schemas.microsoft.com/office/word/2010/wordprocessingCanvas" xmlns:cx="http://schemas.microsoft.com/office/drawing/2014/chartex" xmlns:cx1="http://schemas.microsoft.com/office/drawing/2015/9/8/chartex" xmlns:cx2="http://schemas.microsoft.com/office/drawing/2015/10/21/chartex" xmlns:cx3="http://schemas.microsoft.com/office/drawing/2016/5/9/chartex" xmlns:cx4="http://schemas.microsoft.com/office/drawing/2016/5/10/chartex" xmlns:cx5="http://schemas.microsoft.com/office/drawing/2016/5/11/chartex" xmlns:cx6="http://schemas.microsoft.com/office/drawing/2016/5/12/chartex" xmlns:cx7="http://schemas.microsoft.com/office/drawing/2016/5/13/chartex" xmlns:cx8="http://schemas.microsoft.com/office/drawing/2016/5/14/chartex" xmlns:mc="http://schemas.openxmlformats.org/markup-compatibility/2006" xmlns:aink="http://schemas.microsoft.com/office/drawing/2016/ink" xmlns:am3d="http://schemas.microsoft.com/office/drawing/2017/model3d" xmlns:o="urn:schemas-microsoft-com:office:office" xmlns:oel="http://schemas.microsoft.com/office/2019/extlst" xmlns:r="http://schemas.openxmlformats.org/officeDocument/2006/relationships" xmlns:m="http://schemas.openxmlformats.org/officeDocument/2006/math" xmlns:v="urn:schemas-microsoft-com:vml" xmlns:wp14="http://schemas.microsoft.com/office/word/2010/wordprocessingDrawing" xmlns:wp="http://schemas.openxmlformats.org/drawingml/2006/wordprocessingDrawing" xmlns:w10="urn:schemas-microsoft-com:office:word" xmlns:w="http://schemas.openxmlformats.org/wordprocessingml/2006/main" xmlns:w14="http://schemas.microsoft.com/office/word/2010/wordml" xmlns:w15="http://schemas.microsoft.com/office/word/2012/wordml" xmlns:w16cex="http://schemas.microsoft.com/office/word/2018/wordml/cex" xmlns:w16cid="http://schemas.microsoft.com/office/word/2016/wordml/cid" xmlns:w16="http://schemas.microsoft.com/office/word/2018/wordml" xmlns:w16du="http://schemas.microsoft.com/office/word/2023/wordml/word16du" xmlns:w16sdtdh="http://schemas.microsoft.com/office/word/2020/wordml/sdtdatahash" xmlns:w16sdtfl="http://schemas.microsoft.com/office/word/2024/wordml/sdtformatlock" xmlns:w16se="http://schemas.microsoft.com/office/word/2015/wordml/symex" xmlns:wpg="http://schemas.microsoft.com/office/word/2010/wordprocessingGroup" xmlns:wpi="http://schemas.microsoft.com/office/word/2010/wordprocessingInk" xmlns:wne="http://schemas.microsoft.com/office/word/2006/wordml" xmlns:wps="http://schemas.microsoft.com/office/word/2010/wordprocessingShape" mc:Ignorable="w14 w15 w16se w16cid w16 w16cex w16sdtdh w16sdtfl w16du wp14">
   <w:abstractNum w:abstractNumId="0" w15:restartNumberingAfterBreak="0">
+    <w:nsid w:val="06BB5C95"/>
+    <w:multiLevelType w:val="multilevel"/>
+    <w:tmpl w:val="04C66BD4"/>
+    <w:lvl w:ilvl="0">
+      <w:start w:val="1"/>
+      <w:numFmt w:val="bullet"/>
+      <w:lvlText w:val=""/>
+      <w:lvlJc w:val="left"/>
+      <w:pPr>
+        <w:tabs>
+          <w:tab w:val="num" w:pos="720"/>
+        </w:tabs>
+        <w:ind w:left="720" w:hanging="360"/>
+      </w:pPr>
+      <w:rPr>
+        <w:rFonts w:ascii="Symbol" w:hAnsi="Symbol" w:hint="default"/>
+        <w:sz w:val="20"/>
+      </w:rPr>
+    </w:lvl>
+    <w:lvl w:ilvl="1" w:tentative="1">
+      <w:start w:val="1"/>
+      <w:numFmt w:val="bullet"/>
+      <w:lvlText w:val="o"/>
+      <w:lvlJc w:val="left"/>
+      <w:pPr>
+        <w:tabs>
+          <w:tab w:val="num" w:pos="1440"/>
+        </w:tabs>
+        <w:ind w:left="1440" w:hanging="360"/>
+      </w:pPr>
+      <w:rPr>
+        <w:rFonts w:ascii="Courier New" w:hAnsi="Courier New" w:hint="default"/>
+        <w:sz w:val="20"/>
+      </w:rPr>
+    </w:lvl>
+    <w:lvl w:ilvl="2" w:tentative="1">
+      <w:start w:val="1"/>
+      <w:numFmt w:val="bullet"/>
+      <w:lvlText w:val=""/>
+      <w:lvlJc w:val="left"/>
+      <w:pPr>
+        <w:tabs>
+          <w:tab w:val="num" w:pos="2160"/>
+        </w:tabs>
+        <w:ind w:left="2160" w:hanging="360"/>
+      </w:pPr>
+      <w:rPr>
+        <w:rFonts w:ascii="Wingdings" w:hAnsi="Wingdings" w:hint="default"/>
+        <w:sz w:val="20"/>
+      </w:rPr>
+    </w:lvl>
+    <w:lvl w:ilvl="3" w:tentative="1">
+      <w:start w:val="1"/>
+      <w:numFmt w:val="bullet"/>
+      <w:lvlText w:val=""/>
+      <w:lvlJc w:val="left"/>
+      <w:pPr>
+        <w:tabs>
+          <w:tab w:val="num" w:pos="2880"/>
+        </w:tabs>
+        <w:ind w:left="2880" w:hanging="360"/>
+      </w:pPr>
+      <w:rPr>
+        <w:rFonts w:ascii="Wingdings" w:hAnsi="Wingdings" w:hint="default"/>
+        <w:sz w:val="20"/>
+      </w:rPr>
+    </w:lvl>
+    <w:lvl w:ilvl="4" w:tentative="1">
+      <w:start w:val="1"/>
+      <w:numFmt w:val="bullet"/>
+      <w:lvlText w:val=""/>
+      <w:lvlJc w:val="left"/>
+      <w:pPr>
+        <w:tabs>
+          <w:tab w:val="num" w:pos="3600"/>
+        </w:tabs>
+        <w:ind w:left="3600" w:hanging="360"/>
+      </w:pPr>
+      <w:rPr>
+        <w:rFonts w:ascii="Wingdings" w:hAnsi="Wingdings" w:hint="default"/>
+        <w:sz w:val="20"/>
+      </w:rPr>
+    </w:lvl>
+    <w:lvl w:ilvl="5" w:tentative="1">
+      <w:start w:val="1"/>
+      <w:numFmt w:val="bullet"/>
+      <w:lvlText w:val=""/>
+      <w:lvlJc w:val="left"/>
+      <w:pPr>
+        <w:tabs>
+          <w:tab w:val="num" w:pos="4320"/>
+        </w:tabs>
+        <w:ind w:left="4320" w:hanging="360"/>
+      </w:pPr>
+      <w:rPr>
+        <w:rFonts w:ascii="Wingdings" w:hAnsi="Wingdings" w:hint="default"/>
+        <w:sz w:val="20"/>
+      </w:rPr>
+    </w:lvl>
+    <w:lvl w:ilvl="6" w:tentative="1">
+      <w:start w:val="1"/>
+      <w:numFmt w:val="bullet"/>
+      <w:lvlText w:val=""/>
+      <w:lvlJc w:val="left"/>
+      <w:pPr>
+        <w:tabs>
+          <w:tab w:val="num" w:pos="5040"/>
+        </w:tabs>
+        <w:ind w:left="5040" w:hanging="360"/>
+      </w:pPr>
+      <w:rPr>
+        <w:rFonts w:ascii="Wingdings" w:hAnsi="Wingdings" w:hint="default"/>
+        <w:sz w:val="20"/>
+      </w:rPr>
+    </w:lvl>
+    <w:lvl w:ilvl="7" w:tentative="1">
+      <w:start w:val="1"/>
+      <w:numFmt w:val="bullet"/>
+      <w:lvlText w:val=""/>
+      <w:lvlJc w:val="left"/>
+      <w:pPr>
+        <w:tabs>
+          <w:tab w:val="num" w:pos="5760"/>
+        </w:tabs>
+        <w:ind w:left="5760" w:hanging="360"/>
+      </w:pPr>
+      <w:rPr>
+        <w:rFonts w:ascii="Wingdings" w:hAnsi="Wingdings" w:hint="default"/>
+        <w:sz w:val="20"/>
+      </w:rPr>
+    </w:lvl>
+    <w:lvl w:ilvl="8" w:tentative="1">
+      <w:start w:val="1"/>
+      <w:numFmt w:val="bullet"/>
+      <w:lvlText w:val=""/>
+      <w:lvlJc w:val="left"/>
+      <w:pPr>
+        <w:tabs>
+          <w:tab w:val="num" w:pos="6480"/>
+        </w:tabs>
+        <w:ind w:left="6480" w:hanging="360"/>
+      </w:pPr>
+      <w:rPr>
+        <w:rFonts w:ascii="Wingdings" w:hAnsi="Wingdings" w:hint="default"/>
+        <w:sz w:val="20"/>
+      </w:rPr>
+    </w:lvl>
+  </w:abstractNum>
+  <w:abstractNum w:abstractNumId="1" w15:restartNumberingAfterBreak="0">
     <w:nsid w:val="2FFD4C7F"/>
     <w:multiLevelType w:val="multilevel"/>
     <w:tmpl w:val="CAF0F936"/>
@@ -3645,7 +4696,215 @@
       </w:rPr>
     </w:lvl>
   </w:abstractNum>
+  <w:abstractNum w:abstractNumId="2" w15:restartNumberingAfterBreak="0">
+    <w:nsid w:val="30E326CB"/>
+    <w:multiLevelType w:val="hybridMultilevel"/>
+    <w:tmpl w:val="FB0A4A58"/>
+    <w:lvl w:ilvl="0" w:tplc="580A000F">
+      <w:start w:val="1"/>
+      <w:numFmt w:val="decimal"/>
+      <w:lvlText w:val="%1."/>
+      <w:lvlJc w:val="left"/>
+      <w:pPr>
+        <w:ind w:left="1440" w:hanging="360"/>
+      </w:pPr>
+    </w:lvl>
+    <w:lvl w:ilvl="1" w:tplc="580A0019" w:tentative="1">
+      <w:start w:val="1"/>
+      <w:numFmt w:val="lowerLetter"/>
+      <w:lvlText w:val="%2."/>
+      <w:lvlJc w:val="left"/>
+      <w:pPr>
+        <w:ind w:left="2160" w:hanging="360"/>
+      </w:pPr>
+    </w:lvl>
+    <w:lvl w:ilvl="2" w:tplc="580A001B" w:tentative="1">
+      <w:start w:val="1"/>
+      <w:numFmt w:val="lowerRoman"/>
+      <w:lvlText w:val="%3."/>
+      <w:lvlJc w:val="right"/>
+      <w:pPr>
+        <w:ind w:left="2880" w:hanging="180"/>
+      </w:pPr>
+    </w:lvl>
+    <w:lvl w:ilvl="3" w:tplc="580A000F" w:tentative="1">
+      <w:start w:val="1"/>
+      <w:numFmt w:val="decimal"/>
+      <w:lvlText w:val="%4."/>
+      <w:lvlJc w:val="left"/>
+      <w:pPr>
+        <w:ind w:left="3600" w:hanging="360"/>
+      </w:pPr>
+    </w:lvl>
+    <w:lvl w:ilvl="4" w:tplc="580A0019" w:tentative="1">
+      <w:start w:val="1"/>
+      <w:numFmt w:val="lowerLetter"/>
+      <w:lvlText w:val="%5."/>
+      <w:lvlJc w:val="left"/>
+      <w:pPr>
+        <w:ind w:left="4320" w:hanging="360"/>
+      </w:pPr>
+    </w:lvl>
+    <w:lvl w:ilvl="5" w:tplc="580A001B" w:tentative="1">
+      <w:start w:val="1"/>
+      <w:numFmt w:val="lowerRoman"/>
+      <w:lvlText w:val="%6."/>
+      <w:lvlJc w:val="right"/>
+      <w:pPr>
+        <w:ind w:left="5040" w:hanging="180"/>
+      </w:pPr>
+    </w:lvl>
+    <w:lvl w:ilvl="6" w:tplc="580A000F" w:tentative="1">
+      <w:start w:val="1"/>
+      <w:numFmt w:val="decimal"/>
+      <w:lvlText w:val="%7."/>
+      <w:lvlJc w:val="left"/>
+      <w:pPr>
+        <w:ind w:left="5760" w:hanging="360"/>
+      </w:pPr>
+    </w:lvl>
+    <w:lvl w:ilvl="7" w:tplc="580A0019" w:tentative="1">
+      <w:start w:val="1"/>
+      <w:numFmt w:val="lowerLetter"/>
+      <w:lvlText w:val="%8."/>
+      <w:lvlJc w:val="left"/>
+      <w:pPr>
+        <w:ind w:left="6480" w:hanging="360"/>
+      </w:pPr>
+    </w:lvl>
+    <w:lvl w:ilvl="8" w:tplc="580A001B" w:tentative="1">
+      <w:start w:val="1"/>
+      <w:numFmt w:val="lowerRoman"/>
+      <w:lvlText w:val="%9."/>
+      <w:lvlJc w:val="right"/>
+      <w:pPr>
+        <w:ind w:left="7200" w:hanging="180"/>
+      </w:pPr>
+    </w:lvl>
+  </w:abstractNum>
+  <w:abstractNum w:abstractNumId="3" w15:restartNumberingAfterBreak="0">
+    <w:nsid w:val="69C73608"/>
+    <w:multiLevelType w:val="hybridMultilevel"/>
+    <w:tmpl w:val="CFDCC5F2"/>
+    <w:lvl w:ilvl="0" w:tplc="580A0001">
+      <w:start w:val="1"/>
+      <w:numFmt w:val="bullet"/>
+      <w:lvlText w:val=""/>
+      <w:lvlJc w:val="left"/>
+      <w:pPr>
+        <w:ind w:left="720" w:hanging="360"/>
+      </w:pPr>
+      <w:rPr>
+        <w:rFonts w:ascii="Symbol" w:hAnsi="Symbol" w:hint="default"/>
+      </w:rPr>
+    </w:lvl>
+    <w:lvl w:ilvl="1" w:tplc="580A0003" w:tentative="1">
+      <w:start w:val="1"/>
+      <w:numFmt w:val="bullet"/>
+      <w:lvlText w:val="o"/>
+      <w:lvlJc w:val="left"/>
+      <w:pPr>
+        <w:ind w:left="1440" w:hanging="360"/>
+      </w:pPr>
+      <w:rPr>
+        <w:rFonts w:ascii="Courier New" w:hAnsi="Courier New" w:cs="Courier New" w:hint="default"/>
+      </w:rPr>
+    </w:lvl>
+    <w:lvl w:ilvl="2" w:tplc="580A0005" w:tentative="1">
+      <w:start w:val="1"/>
+      <w:numFmt w:val="bullet"/>
+      <w:lvlText w:val=""/>
+      <w:lvlJc w:val="left"/>
+      <w:pPr>
+        <w:ind w:left="2160" w:hanging="360"/>
+      </w:pPr>
+      <w:rPr>
+        <w:rFonts w:ascii="Wingdings" w:hAnsi="Wingdings" w:hint="default"/>
+      </w:rPr>
+    </w:lvl>
+    <w:lvl w:ilvl="3" w:tplc="580A0001" w:tentative="1">
+      <w:start w:val="1"/>
+      <w:numFmt w:val="bullet"/>
+      <w:lvlText w:val=""/>
+      <w:lvlJc w:val="left"/>
+      <w:pPr>
+        <w:ind w:left="2880" w:hanging="360"/>
+      </w:pPr>
+      <w:rPr>
+        <w:rFonts w:ascii="Symbol" w:hAnsi="Symbol" w:hint="default"/>
+      </w:rPr>
+    </w:lvl>
+    <w:lvl w:ilvl="4" w:tplc="580A0003" w:tentative="1">
+      <w:start w:val="1"/>
+      <w:numFmt w:val="bullet"/>
+      <w:lvlText w:val="o"/>
+      <w:lvlJc w:val="left"/>
+      <w:pPr>
+        <w:ind w:left="3600" w:hanging="360"/>
+      </w:pPr>
+      <w:rPr>
+        <w:rFonts w:ascii="Courier New" w:hAnsi="Courier New" w:cs="Courier New" w:hint="default"/>
+      </w:rPr>
+    </w:lvl>
+    <w:lvl w:ilvl="5" w:tplc="580A0005" w:tentative="1">
+      <w:start w:val="1"/>
+      <w:numFmt w:val="bullet"/>
+      <w:lvlText w:val=""/>
+      <w:lvlJc w:val="left"/>
+      <w:pPr>
+        <w:ind w:left="4320" w:hanging="360"/>
+      </w:pPr>
+      <w:rPr>
+        <w:rFonts w:ascii="Wingdings" w:hAnsi="Wingdings" w:hint="default"/>
+      </w:rPr>
+    </w:lvl>
+    <w:lvl w:ilvl="6" w:tplc="580A0001" w:tentative="1">
+      <w:start w:val="1"/>
+      <w:numFmt w:val="bullet"/>
+      <w:lvlText w:val=""/>
+      <w:lvlJc w:val="left"/>
+      <w:pPr>
+        <w:ind w:left="5040" w:hanging="360"/>
+      </w:pPr>
+      <w:rPr>
+        <w:rFonts w:ascii="Symbol" w:hAnsi="Symbol" w:hint="default"/>
+      </w:rPr>
+    </w:lvl>
+    <w:lvl w:ilvl="7" w:tplc="580A0003" w:tentative="1">
+      <w:start w:val="1"/>
+      <w:numFmt w:val="bullet"/>
+      <w:lvlText w:val="o"/>
+      <w:lvlJc w:val="left"/>
+      <w:pPr>
+        <w:ind w:left="5760" w:hanging="360"/>
+      </w:pPr>
+      <w:rPr>
+        <w:rFonts w:ascii="Courier New" w:hAnsi="Courier New" w:cs="Courier New" w:hint="default"/>
+      </w:rPr>
+    </w:lvl>
+    <w:lvl w:ilvl="8" w:tplc="580A0005" w:tentative="1">
+      <w:start w:val="1"/>
+      <w:numFmt w:val="bullet"/>
+      <w:lvlText w:val=""/>
+      <w:lvlJc w:val="left"/>
+      <w:pPr>
+        <w:ind w:left="6480" w:hanging="360"/>
+      </w:pPr>
+      <w:rPr>
+        <w:rFonts w:ascii="Wingdings" w:hAnsi="Wingdings" w:hint="default"/>
+      </w:rPr>
+    </w:lvl>
+  </w:abstractNum>
   <w:num w:numId="1" w16cid:durableId="223834104">
+    <w:abstractNumId w:val="1"/>
+  </w:num>
+  <w:num w:numId="2" w16cid:durableId="1570339003">
+    <w:abstractNumId w:val="3"/>
+  </w:num>
+  <w:num w:numId="3" w16cid:durableId="361633764">
+    <w:abstractNumId w:val="2"/>
+  </w:num>
+  <w:num w:numId="4" w16cid:durableId="362752053">
     <w:abstractNumId w:val="0"/>
   </w:num>
 </w:numbering>
@@ -4079,7 +5338,6 @@
   <w:style w:type="character" w:default="1" w:styleId="Fuentedeprrafopredeter">
     <w:name w:val="Default Paragraph Font"/>
     <w:uiPriority w:val="1"/>
-    <w:semiHidden/>
     <w:unhideWhenUsed/>
   </w:style>
   <w:style w:type="table" w:default="1" w:styleId="Tablanormal">
@@ -4343,6 +5601,17 @@
       <w:sz w:val="20"/>
       <w:szCs w:val="20"/>
     </w:rPr>
+  </w:style>
+  <w:style w:type="paragraph" w:styleId="Prrafodelista">
+    <w:name w:val="List Paragraph"/>
+    <w:basedOn w:val="Normal"/>
+    <w:uiPriority w:val="34"/>
+    <w:qFormat/>
+    <w:rsid w:val="00C75ACA"/>
+    <w:pPr>
+      <w:ind w:left="720"/>
+      <w:contextualSpacing/>
+    </w:pPr>
   </w:style>
 </w:styles>
 </file>
@@ -4643,12 +5912,9 @@
 </file>
 
 <file path=customXml/item1.xml><?xml version="1.0" encoding="utf-8"?>
-<?mso-contentType ?>
-<FormTemplates xmlns="http://schemas.microsoft.com/sharepoint/v3/contenttype/forms">
-  <Display>DocumentLibraryForm</Display>
-  <Edit>DocumentLibraryForm</Edit>
-  <New>DocumentLibraryForm</New>
-</FormTemplates>
+<p:properties xmlns:p="http://schemas.microsoft.com/office/2006/metadata/properties" xmlns:xsi="http://www.w3.org/2001/XMLSchema-instance" xmlns:pc="http://schemas.microsoft.com/office/infopath/2007/PartnerControls">
+  <documentManagement/>
+</p:properties>
 </file>
 
 <file path=customXml/item2.xml><?xml version="1.0" encoding="utf-8"?>
@@ -4784,15 +6050,19 @@
 </file>
 
 <file path=customXml/item3.xml><?xml version="1.0" encoding="utf-8"?>
-<p:properties xmlns:p="http://schemas.microsoft.com/office/2006/metadata/properties" xmlns:xsi="http://www.w3.org/2001/XMLSchema-instance" xmlns:pc="http://schemas.microsoft.com/office/infopath/2007/PartnerControls">
-  <documentManagement/>
-</p:properties>
+<?mso-contentType ?>
+<FormTemplates xmlns="http://schemas.microsoft.com/sharepoint/v3/contenttype/forms">
+  <Display>DocumentLibraryForm</Display>
+  <Edit>DocumentLibraryForm</Edit>
+  <New>DocumentLibraryForm</New>
+</FormTemplates>
 </file>
 
 <file path=customXml/itemProps1.xml><?xml version="1.0" encoding="utf-8"?>
-<ds:datastoreItem xmlns:ds="http://schemas.openxmlformats.org/officeDocument/2006/customXml" ds:itemID="{D51C61E4-DB75-4684-AD25-71F546404E96}">
+<ds:datastoreItem xmlns:ds="http://schemas.openxmlformats.org/officeDocument/2006/customXml" ds:itemID="{46CA5683-AF87-4E40-B841-2E23A3B52406}">
   <ds:schemaRefs>
-    <ds:schemaRef ds:uri="http://schemas.microsoft.com/sharepoint/v3/contenttype/forms"/>
+    <ds:schemaRef ds:uri="http://schemas.microsoft.com/office/2006/metadata/properties"/>
+    <ds:schemaRef ds:uri="http://schemas.microsoft.com/office/infopath/2007/PartnerControls"/>
   </ds:schemaRefs>
 </ds:datastoreItem>
 </file>
@@ -4816,10 +6086,9 @@
 </file>
 
 <file path=customXml/itemProps3.xml><?xml version="1.0" encoding="utf-8"?>
-<ds:datastoreItem xmlns:ds="http://schemas.openxmlformats.org/officeDocument/2006/customXml" ds:itemID="{46CA5683-AF87-4E40-B841-2E23A3B52406}">
+<ds:datastoreItem xmlns:ds="http://schemas.openxmlformats.org/officeDocument/2006/customXml" ds:itemID="{D51C61E4-DB75-4684-AD25-71F546404E96}">
   <ds:schemaRefs>
-    <ds:schemaRef ds:uri="http://schemas.microsoft.com/office/2006/metadata/properties"/>
-    <ds:schemaRef ds:uri="http://schemas.microsoft.com/office/infopath/2007/PartnerControls"/>
+    <ds:schemaRef ds:uri="http://schemas.microsoft.com/sharepoint/v3/contenttype/forms"/>
   </ds:schemaRefs>
 </ds:datastoreItem>
 </file>
</xml_diff>